<commit_message>
docs: elimina las referencias a archivos retirados y corrige el conteo de pruebas del documento tecnico
Los entregables quedan solo en Word: README, AGENTS.md y DESIGN.md enlazan docs/documento-tecnico.docx y docs/manual-de-usuario.docx, se retira el script generador y su grupo de dependencias, y el documento tecnico reporta las 909 pruebas reales sin citar archivos inexistentes.
</commit_message>
<xml_diff>
--- a/docs/documento-tecnico.docx
+++ b/docs/documento-tecnico.docx
@@ -104,7 +104,7 @@
           <w:r>
             <w:fldChar w:fldCharType="separate"/>
           </w:r>
-          <w:hyperlink w:anchor="_Toc243182323" w:history="1">
+          <w:hyperlink w:anchor="_Toc243184674" w:history="1">
             <w:r>
               <w:rPr>
                 <w:rStyle w:val="Hipervnculo"/>
@@ -131,7 +131,7 @@
                 <w:noProof/>
                 <w:webHidden/>
               </w:rPr>
-              <w:instrText xml:space="preserve"> PAGEREF _Toc243182323 \h </w:instrText>
+              <w:instrText xml:space="preserve"> PAGEREF _Toc243184674 \h </w:instrText>
             </w:r>
             <w:r>
               <w:rPr>
@@ -178,7 +178,7 @@
               <w14:ligatures w14:val="standardContextual"/>
             </w:rPr>
           </w:pPr>
-          <w:hyperlink w:anchor="_Toc243182324" w:history="1">
+          <w:hyperlink w:anchor="_Toc243184675" w:history="1">
             <w:r>
               <w:rPr>
                 <w:rStyle w:val="Hipervnculo"/>
@@ -205,7 +205,7 @@
                 <w:noProof/>
                 <w:webHidden/>
               </w:rPr>
-              <w:instrText xml:space="preserve"> PAGEREF _Toc243182324 \h </w:instrText>
+              <w:instrText xml:space="preserve"> PAGEREF _Toc243184675 \h </w:instrText>
             </w:r>
             <w:r>
               <w:rPr>
@@ -252,7 +252,7 @@
               <w14:ligatures w14:val="standardContextual"/>
             </w:rPr>
           </w:pPr>
-          <w:hyperlink w:anchor="_Toc243182325" w:history="1">
+          <w:hyperlink w:anchor="_Toc243184676" w:history="1">
             <w:r>
               <w:rPr>
                 <w:rStyle w:val="Hipervnculo"/>
@@ -279,7 +279,7 @@
                 <w:noProof/>
                 <w:webHidden/>
               </w:rPr>
-              <w:instrText xml:space="preserve"> PAGEREF _Toc243182325 \h </w:instrText>
+              <w:instrText xml:space="preserve"> PAGEREF _Toc243184676 \h </w:instrText>
             </w:r>
             <w:r>
               <w:rPr>
@@ -326,7 +326,7 @@
               <w14:ligatures w14:val="standardContextual"/>
             </w:rPr>
           </w:pPr>
-          <w:hyperlink w:anchor="_Toc243182326" w:history="1">
+          <w:hyperlink w:anchor="_Toc243184677" w:history="1">
             <w:r>
               <w:rPr>
                 <w:rStyle w:val="Hipervnculo"/>
@@ -353,7 +353,7 @@
                 <w:noProof/>
                 <w:webHidden/>
               </w:rPr>
-              <w:instrText xml:space="preserve"> PAGEREF _Toc243182326 \h </w:instrText>
+              <w:instrText xml:space="preserve"> PAGEREF _Toc243184677 \h </w:instrText>
             </w:r>
             <w:r>
               <w:rPr>
@@ -400,7 +400,7 @@
               <w14:ligatures w14:val="standardContextual"/>
             </w:rPr>
           </w:pPr>
-          <w:hyperlink w:anchor="_Toc243182327" w:history="1">
+          <w:hyperlink w:anchor="_Toc243184678" w:history="1">
             <w:r>
               <w:rPr>
                 <w:rStyle w:val="Hipervnculo"/>
@@ -427,7 +427,7 @@
                 <w:noProof/>
                 <w:webHidden/>
               </w:rPr>
-              <w:instrText xml:space="preserve"> PAGEREF _Toc243182327 \h </w:instrText>
+              <w:instrText xml:space="preserve"> PAGEREF _Toc243184678 \h </w:instrText>
             </w:r>
             <w:r>
               <w:rPr>
@@ -474,7 +474,7 @@
               <w14:ligatures w14:val="standardContextual"/>
             </w:rPr>
           </w:pPr>
-          <w:hyperlink w:anchor="_Toc243182328" w:history="1">
+          <w:hyperlink w:anchor="_Toc243184679" w:history="1">
             <w:r>
               <w:rPr>
                 <w:rStyle w:val="Hipervnculo"/>
@@ -501,7 +501,7 @@
                 <w:noProof/>
                 <w:webHidden/>
               </w:rPr>
-              <w:instrText xml:space="preserve"> PAGEREF _Toc243182328 \h </w:instrText>
+              <w:instrText xml:space="preserve"> PAGEREF _Toc243184679 \h </w:instrText>
             </w:r>
             <w:r>
               <w:rPr>
@@ -548,7 +548,7 @@
               <w14:ligatures w14:val="standardContextual"/>
             </w:rPr>
           </w:pPr>
-          <w:hyperlink w:anchor="_Toc243182329" w:history="1">
+          <w:hyperlink w:anchor="_Toc243184680" w:history="1">
             <w:r>
               <w:rPr>
                 <w:rStyle w:val="Hipervnculo"/>
@@ -575,7 +575,7 @@
                 <w:noProof/>
                 <w:webHidden/>
               </w:rPr>
-              <w:instrText xml:space="preserve"> PAGEREF _Toc243182329 \h </w:instrText>
+              <w:instrText xml:space="preserve"> PAGEREF _Toc243184680 \h </w:instrText>
             </w:r>
             <w:r>
               <w:rPr>
@@ -622,7 +622,7 @@
               <w14:ligatures w14:val="standardContextual"/>
             </w:rPr>
           </w:pPr>
-          <w:hyperlink w:anchor="_Toc243182330" w:history="1">
+          <w:hyperlink w:anchor="_Toc243184681" w:history="1">
             <w:r>
               <w:rPr>
                 <w:rStyle w:val="Hipervnculo"/>
@@ -649,7 +649,7 @@
                 <w:noProof/>
                 <w:webHidden/>
               </w:rPr>
-              <w:instrText xml:space="preserve"> PAGEREF _Toc243182330 \h </w:instrText>
+              <w:instrText xml:space="preserve"> PAGEREF _Toc243184681 \h </w:instrText>
             </w:r>
             <w:r>
               <w:rPr>
@@ -696,7 +696,7 @@
               <w14:ligatures w14:val="standardContextual"/>
             </w:rPr>
           </w:pPr>
-          <w:hyperlink w:anchor="_Toc243182331" w:history="1">
+          <w:hyperlink w:anchor="_Toc243184682" w:history="1">
             <w:r>
               <w:rPr>
                 <w:rStyle w:val="Hipervnculo"/>
@@ -723,7 +723,7 @@
                 <w:noProof/>
                 <w:webHidden/>
               </w:rPr>
-              <w:instrText xml:space="preserve"> PAGEREF _Toc243182331 \h </w:instrText>
+              <w:instrText xml:space="preserve"> PAGEREF _Toc243184682 \h </w:instrText>
             </w:r>
             <w:r>
               <w:rPr>
@@ -770,7 +770,7 @@
               <w14:ligatures w14:val="standardContextual"/>
             </w:rPr>
           </w:pPr>
-          <w:hyperlink w:anchor="_Toc243182332" w:history="1">
+          <w:hyperlink w:anchor="_Toc243184683" w:history="1">
             <w:r>
               <w:rPr>
                 <w:rStyle w:val="Hipervnculo"/>
@@ -797,7 +797,7 @@
                 <w:noProof/>
                 <w:webHidden/>
               </w:rPr>
-              <w:instrText xml:space="preserve"> PAGEREF _Toc243182332 \h </w:instrText>
+              <w:instrText xml:space="preserve"> PAGEREF _Toc243184683 \h </w:instrText>
             </w:r>
             <w:r>
               <w:rPr>
@@ -844,7 +844,7 @@
               <w14:ligatures w14:val="standardContextual"/>
             </w:rPr>
           </w:pPr>
-          <w:hyperlink w:anchor="_Toc243182333" w:history="1">
+          <w:hyperlink w:anchor="_Toc243184684" w:history="1">
             <w:r>
               <w:rPr>
                 <w:rStyle w:val="Hipervnculo"/>
@@ -871,7 +871,7 @@
                 <w:noProof/>
                 <w:webHidden/>
               </w:rPr>
-              <w:instrText xml:space="preserve"> PAGEREF _Toc243182333 \h </w:instrText>
+              <w:instrText xml:space="preserve"> PAGEREF _Toc243184684 \h </w:instrText>
             </w:r>
             <w:r>
               <w:rPr>
@@ -918,7 +918,7 @@
               <w14:ligatures w14:val="standardContextual"/>
             </w:rPr>
           </w:pPr>
-          <w:hyperlink w:anchor="_Toc243182334" w:history="1">
+          <w:hyperlink w:anchor="_Toc243184685" w:history="1">
             <w:r>
               <w:rPr>
                 <w:rStyle w:val="Hipervnculo"/>
@@ -945,7 +945,7 @@
                 <w:noProof/>
                 <w:webHidden/>
               </w:rPr>
-              <w:instrText xml:space="preserve"> PAGEREF _Toc243182334 \h </w:instrText>
+              <w:instrText xml:space="preserve"> PAGEREF _Toc243184685 \h </w:instrText>
             </w:r>
             <w:r>
               <w:rPr>
@@ -992,7 +992,7 @@
               <w14:ligatures w14:val="standardContextual"/>
             </w:rPr>
           </w:pPr>
-          <w:hyperlink w:anchor="_Toc243182335" w:history="1">
+          <w:hyperlink w:anchor="_Toc243184686" w:history="1">
             <w:r>
               <w:rPr>
                 <w:rStyle w:val="Hipervnculo"/>
@@ -1019,7 +1019,7 @@
                 <w:noProof/>
                 <w:webHidden/>
               </w:rPr>
-              <w:instrText xml:space="preserve"> PAGEREF _Toc243182335 \h </w:instrText>
+              <w:instrText xml:space="preserve"> PAGEREF _Toc243184686 \h </w:instrText>
             </w:r>
             <w:r>
               <w:rPr>
@@ -1066,7 +1066,7 @@
               <w14:ligatures w14:val="standardContextual"/>
             </w:rPr>
           </w:pPr>
-          <w:hyperlink w:anchor="_Toc243182336" w:history="1">
+          <w:hyperlink w:anchor="_Toc243184687" w:history="1">
             <w:r>
               <w:rPr>
                 <w:rStyle w:val="Hipervnculo"/>
@@ -1093,7 +1093,7 @@
                 <w:noProof/>
                 <w:webHidden/>
               </w:rPr>
-              <w:instrText xml:space="preserve"> PAGEREF _Toc243182336 \h </w:instrText>
+              <w:instrText xml:space="preserve"> PAGEREF _Toc243184687 \h </w:instrText>
             </w:r>
             <w:r>
               <w:rPr>
@@ -1140,7 +1140,7 @@
               <w14:ligatures w14:val="standardContextual"/>
             </w:rPr>
           </w:pPr>
-          <w:hyperlink w:anchor="_Toc243182337" w:history="1">
+          <w:hyperlink w:anchor="_Toc243184688" w:history="1">
             <w:r>
               <w:rPr>
                 <w:rStyle w:val="Hipervnculo"/>
@@ -1167,7 +1167,7 @@
                 <w:noProof/>
                 <w:webHidden/>
               </w:rPr>
-              <w:instrText xml:space="preserve"> PAGEREF _Toc243182337 \h </w:instrText>
+              <w:instrText xml:space="preserve"> PAGEREF _Toc243184688 \h </w:instrText>
             </w:r>
             <w:r>
               <w:rPr>
@@ -1214,7 +1214,7 @@
               <w14:ligatures w14:val="standardContextual"/>
             </w:rPr>
           </w:pPr>
-          <w:hyperlink w:anchor="_Toc243182338" w:history="1">
+          <w:hyperlink w:anchor="_Toc243184689" w:history="1">
             <w:r>
               <w:rPr>
                 <w:rStyle w:val="Hipervnculo"/>
@@ -1241,7 +1241,7 @@
                 <w:noProof/>
                 <w:webHidden/>
               </w:rPr>
-              <w:instrText xml:space="preserve"> PAGEREF _Toc243182338 \h </w:instrText>
+              <w:instrText xml:space="preserve"> PAGEREF _Toc243184689 \h </w:instrText>
             </w:r>
             <w:r>
               <w:rPr>
@@ -1288,7 +1288,7 @@
               <w14:ligatures w14:val="standardContextual"/>
             </w:rPr>
           </w:pPr>
-          <w:hyperlink w:anchor="_Toc243182339" w:history="1">
+          <w:hyperlink w:anchor="_Toc243184690" w:history="1">
             <w:r>
               <w:rPr>
                 <w:rStyle w:val="Hipervnculo"/>
@@ -1315,7 +1315,7 @@
                 <w:noProof/>
                 <w:webHidden/>
               </w:rPr>
-              <w:instrText xml:space="preserve"> PAGEREF _Toc243182339 \h </w:instrText>
+              <w:instrText xml:space="preserve"> PAGEREF _Toc243184690 \h </w:instrText>
             </w:r>
             <w:r>
               <w:rPr>
@@ -1362,7 +1362,7 @@
               <w14:ligatures w14:val="standardContextual"/>
             </w:rPr>
           </w:pPr>
-          <w:hyperlink w:anchor="_Toc243182340" w:history="1">
+          <w:hyperlink w:anchor="_Toc243184691" w:history="1">
             <w:r>
               <w:rPr>
                 <w:rStyle w:val="Hipervnculo"/>
@@ -1389,7 +1389,7 @@
                 <w:noProof/>
                 <w:webHidden/>
               </w:rPr>
-              <w:instrText xml:space="preserve"> PAGEREF _Toc243182340 \h </w:instrText>
+              <w:instrText xml:space="preserve"> PAGEREF _Toc243184691 \h </w:instrText>
             </w:r>
             <w:r>
               <w:rPr>
@@ -1436,7 +1436,7 @@
               <w14:ligatures w14:val="standardContextual"/>
             </w:rPr>
           </w:pPr>
-          <w:hyperlink w:anchor="_Toc243182341" w:history="1">
+          <w:hyperlink w:anchor="_Toc243184692" w:history="1">
             <w:r>
               <w:rPr>
                 <w:rStyle w:val="Hipervnculo"/>
@@ -1463,7 +1463,7 @@
                 <w:noProof/>
                 <w:webHidden/>
               </w:rPr>
-              <w:instrText xml:space="preserve"> PAGEREF _Toc243182341 \h </w:instrText>
+              <w:instrText xml:space="preserve"> PAGEREF _Toc243184692 \h </w:instrText>
             </w:r>
             <w:r>
               <w:rPr>
@@ -1510,7 +1510,7 @@
               <w14:ligatures w14:val="standardContextual"/>
             </w:rPr>
           </w:pPr>
-          <w:hyperlink w:anchor="_Toc243182342" w:history="1">
+          <w:hyperlink w:anchor="_Toc243184693" w:history="1">
             <w:r>
               <w:rPr>
                 <w:rStyle w:val="Hipervnculo"/>
@@ -1537,7 +1537,7 @@
                 <w:noProof/>
                 <w:webHidden/>
               </w:rPr>
-              <w:instrText xml:space="preserve"> PAGEREF _Toc243182342 \h </w:instrText>
+              <w:instrText xml:space="preserve"> PAGEREF _Toc243184693 \h </w:instrText>
             </w:r>
             <w:r>
               <w:rPr>
@@ -1584,7 +1584,7 @@
               <w14:ligatures w14:val="standardContextual"/>
             </w:rPr>
           </w:pPr>
-          <w:hyperlink w:anchor="_Toc243182343" w:history="1">
+          <w:hyperlink w:anchor="_Toc243184694" w:history="1">
             <w:r>
               <w:rPr>
                 <w:rStyle w:val="Hipervnculo"/>
@@ -1611,7 +1611,7 @@
                 <w:noProof/>
                 <w:webHidden/>
               </w:rPr>
-              <w:instrText xml:space="preserve"> PAGEREF _Toc243182343 \h </w:instrText>
+              <w:instrText xml:space="preserve"> PAGEREF _Toc243184694 \h </w:instrText>
             </w:r>
             <w:r>
               <w:rPr>
@@ -1658,7 +1658,7 @@
               <w14:ligatures w14:val="standardContextual"/>
             </w:rPr>
           </w:pPr>
-          <w:hyperlink w:anchor="_Toc243182344" w:history="1">
+          <w:hyperlink w:anchor="_Toc243184695" w:history="1">
             <w:r>
               <w:rPr>
                 <w:rStyle w:val="Hipervnculo"/>
@@ -1685,7 +1685,7 @@
                 <w:noProof/>
                 <w:webHidden/>
               </w:rPr>
-              <w:instrText xml:space="preserve"> PAGEREF _Toc243182344 \h </w:instrText>
+              <w:instrText xml:space="preserve"> PAGEREF _Toc243184695 \h </w:instrText>
             </w:r>
             <w:r>
               <w:rPr>
@@ -1732,7 +1732,7 @@
               <w14:ligatures w14:val="standardContextual"/>
             </w:rPr>
           </w:pPr>
-          <w:hyperlink w:anchor="_Toc243182345" w:history="1">
+          <w:hyperlink w:anchor="_Toc243184696" w:history="1">
             <w:r>
               <w:rPr>
                 <w:rStyle w:val="Hipervnculo"/>
@@ -1759,7 +1759,7 @@
                 <w:noProof/>
                 <w:webHidden/>
               </w:rPr>
-              <w:instrText xml:space="preserve"> PAGEREF _Toc243182345 \h </w:instrText>
+              <w:instrText xml:space="preserve"> PAGEREF _Toc243184696 \h </w:instrText>
             </w:r>
             <w:r>
               <w:rPr>
@@ -1806,7 +1806,7 @@
               <w14:ligatures w14:val="standardContextual"/>
             </w:rPr>
           </w:pPr>
-          <w:hyperlink w:anchor="_Toc243182346" w:history="1">
+          <w:hyperlink w:anchor="_Toc243184697" w:history="1">
             <w:r>
               <w:rPr>
                 <w:rStyle w:val="Hipervnculo"/>
@@ -1833,7 +1833,7 @@
                 <w:noProof/>
                 <w:webHidden/>
               </w:rPr>
-              <w:instrText xml:space="preserve"> PAGEREF _Toc243182346 \h </w:instrText>
+              <w:instrText xml:space="preserve"> PAGEREF _Toc243184697 \h </w:instrText>
             </w:r>
             <w:r>
               <w:rPr>
@@ -1880,7 +1880,7 @@
               <w14:ligatures w14:val="standardContextual"/>
             </w:rPr>
           </w:pPr>
-          <w:hyperlink w:anchor="_Toc243182347" w:history="1">
+          <w:hyperlink w:anchor="_Toc243184698" w:history="1">
             <w:r>
               <w:rPr>
                 <w:rStyle w:val="Hipervnculo"/>
@@ -1907,7 +1907,7 @@
                 <w:noProof/>
                 <w:webHidden/>
               </w:rPr>
-              <w:instrText xml:space="preserve"> PAGEREF _Toc243182347 \h </w:instrText>
+              <w:instrText xml:space="preserve"> PAGEREF _Toc243184698 \h </w:instrText>
             </w:r>
             <w:r>
               <w:rPr>
@@ -1954,7 +1954,7 @@
               <w14:ligatures w14:val="standardContextual"/>
             </w:rPr>
           </w:pPr>
-          <w:hyperlink w:anchor="_Toc243182348" w:history="1">
+          <w:hyperlink w:anchor="_Toc243184699" w:history="1">
             <w:r>
               <w:rPr>
                 <w:rStyle w:val="Hipervnculo"/>
@@ -1981,7 +1981,7 @@
                 <w:noProof/>
                 <w:webHidden/>
               </w:rPr>
-              <w:instrText xml:space="preserve"> PAGEREF _Toc243182348 \h </w:instrText>
+              <w:instrText xml:space="preserve"> PAGEREF _Toc243184699 \h </w:instrText>
             </w:r>
             <w:r>
               <w:rPr>
@@ -2028,7 +2028,7 @@
               <w14:ligatures w14:val="standardContextual"/>
             </w:rPr>
           </w:pPr>
-          <w:hyperlink w:anchor="_Toc243182349" w:history="1">
+          <w:hyperlink w:anchor="_Toc243184700" w:history="1">
             <w:r>
               <w:rPr>
                 <w:rStyle w:val="Hipervnculo"/>
@@ -2055,7 +2055,7 @@
                 <w:noProof/>
                 <w:webHidden/>
               </w:rPr>
-              <w:instrText xml:space="preserve"> PAGEREF _Toc243182349 \h </w:instrText>
+              <w:instrText xml:space="preserve"> PAGEREF _Toc243184700 \h </w:instrText>
             </w:r>
             <w:r>
               <w:rPr>
@@ -2102,7 +2102,7 @@
               <w14:ligatures w14:val="standardContextual"/>
             </w:rPr>
           </w:pPr>
-          <w:hyperlink w:anchor="_Toc243182350" w:history="1">
+          <w:hyperlink w:anchor="_Toc243184701" w:history="1">
             <w:r>
               <w:rPr>
                 <w:rStyle w:val="Hipervnculo"/>
@@ -2129,7 +2129,7 @@
                 <w:noProof/>
                 <w:webHidden/>
               </w:rPr>
-              <w:instrText xml:space="preserve"> PAGEREF _Toc243182350 \h </w:instrText>
+              <w:instrText xml:space="preserve"> PAGEREF _Toc243184701 \h </w:instrText>
             </w:r>
             <w:r>
               <w:rPr>
@@ -2176,7 +2176,7 @@
               <w14:ligatures w14:val="standardContextual"/>
             </w:rPr>
           </w:pPr>
-          <w:hyperlink w:anchor="_Toc243182351" w:history="1">
+          <w:hyperlink w:anchor="_Toc243184702" w:history="1">
             <w:r>
               <w:rPr>
                 <w:rStyle w:val="Hipervnculo"/>
@@ -2203,7 +2203,7 @@
                 <w:noProof/>
                 <w:webHidden/>
               </w:rPr>
-              <w:instrText xml:space="preserve"> PAGEREF _Toc243182351 \h </w:instrText>
+              <w:instrText xml:space="preserve"> PAGEREF _Toc243184702 \h </w:instrText>
             </w:r>
             <w:r>
               <w:rPr>
@@ -2250,7 +2250,7 @@
               <w14:ligatures w14:val="standardContextual"/>
             </w:rPr>
           </w:pPr>
-          <w:hyperlink w:anchor="_Toc243182352" w:history="1">
+          <w:hyperlink w:anchor="_Toc243184703" w:history="1">
             <w:r>
               <w:rPr>
                 <w:rStyle w:val="Hipervnculo"/>
@@ -2277,7 +2277,7 @@
                 <w:noProof/>
                 <w:webHidden/>
               </w:rPr>
-              <w:instrText xml:space="preserve"> PAGEREF _Toc243182352 \h </w:instrText>
+              <w:instrText xml:space="preserve"> PAGEREF _Toc243184703 \h </w:instrText>
             </w:r>
             <w:r>
               <w:rPr>
@@ -2324,7 +2324,7 @@
               <w14:ligatures w14:val="standardContextual"/>
             </w:rPr>
           </w:pPr>
-          <w:hyperlink w:anchor="_Toc243182353" w:history="1">
+          <w:hyperlink w:anchor="_Toc243184704" w:history="1">
             <w:r>
               <w:rPr>
                 <w:rStyle w:val="Hipervnculo"/>
@@ -2351,7 +2351,7 @@
                 <w:noProof/>
                 <w:webHidden/>
               </w:rPr>
-              <w:instrText xml:space="preserve"> PAGEREF _Toc243182353 \h </w:instrText>
+              <w:instrText xml:space="preserve"> PAGEREF _Toc243184704 \h </w:instrText>
             </w:r>
             <w:r>
               <w:rPr>
@@ -2398,7 +2398,7 @@
               <w14:ligatures w14:val="standardContextual"/>
             </w:rPr>
           </w:pPr>
-          <w:hyperlink w:anchor="_Toc243182354" w:history="1">
+          <w:hyperlink w:anchor="_Toc243184705" w:history="1">
             <w:r>
               <w:rPr>
                 <w:rStyle w:val="Hipervnculo"/>
@@ -2425,7 +2425,7 @@
                 <w:noProof/>
                 <w:webHidden/>
               </w:rPr>
-              <w:instrText xml:space="preserve"> PAGEREF _Toc243182354 \h </w:instrText>
+              <w:instrText xml:space="preserve"> PAGEREF _Toc243184705 \h </w:instrText>
             </w:r>
             <w:r>
               <w:rPr>
@@ -2472,7 +2472,7 @@
               <w14:ligatures w14:val="standardContextual"/>
             </w:rPr>
           </w:pPr>
-          <w:hyperlink w:anchor="_Toc243182355" w:history="1">
+          <w:hyperlink w:anchor="_Toc243184706" w:history="1">
             <w:r>
               <w:rPr>
                 <w:rStyle w:val="Hipervnculo"/>
@@ -2499,7 +2499,7 @@
                 <w:noProof/>
                 <w:webHidden/>
               </w:rPr>
-              <w:instrText xml:space="preserve"> PAGEREF _Toc243182355 \h </w:instrText>
+              <w:instrText xml:space="preserve"> PAGEREF _Toc243184706 \h </w:instrText>
             </w:r>
             <w:r>
               <w:rPr>
@@ -2546,7 +2546,7 @@
               <w14:ligatures w14:val="standardContextual"/>
             </w:rPr>
           </w:pPr>
-          <w:hyperlink w:anchor="_Toc243182356" w:history="1">
+          <w:hyperlink w:anchor="_Toc243184707" w:history="1">
             <w:r>
               <w:rPr>
                 <w:rStyle w:val="Hipervnculo"/>
@@ -2573,7 +2573,7 @@
                 <w:noProof/>
                 <w:webHidden/>
               </w:rPr>
-              <w:instrText xml:space="preserve"> PAGEREF _Toc243182356 \h </w:instrText>
+              <w:instrText xml:space="preserve"> PAGEREF _Toc243184707 \h </w:instrText>
             </w:r>
             <w:r>
               <w:rPr>
@@ -2620,7 +2620,7 @@
               <w14:ligatures w14:val="standardContextual"/>
             </w:rPr>
           </w:pPr>
-          <w:hyperlink w:anchor="_Toc243182357" w:history="1">
+          <w:hyperlink w:anchor="_Toc243184708" w:history="1">
             <w:r>
               <w:rPr>
                 <w:rStyle w:val="Hipervnculo"/>
@@ -2647,7 +2647,7 @@
                 <w:noProof/>
                 <w:webHidden/>
               </w:rPr>
-              <w:instrText xml:space="preserve"> PAGEREF _Toc243182357 \h </w:instrText>
+              <w:instrText xml:space="preserve"> PAGEREF _Toc243184708 \h </w:instrText>
             </w:r>
             <w:r>
               <w:rPr>
@@ -2694,7 +2694,7 @@
               <w14:ligatures w14:val="standardContextual"/>
             </w:rPr>
           </w:pPr>
-          <w:hyperlink w:anchor="_Toc243182358" w:history="1">
+          <w:hyperlink w:anchor="_Toc243184709" w:history="1">
             <w:r>
               <w:rPr>
                 <w:rStyle w:val="Hipervnculo"/>
@@ -2721,7 +2721,7 @@
                 <w:noProof/>
                 <w:webHidden/>
               </w:rPr>
-              <w:instrText xml:space="preserve"> PAGEREF _Toc243182358 \h </w:instrText>
+              <w:instrText xml:space="preserve"> PAGEREF _Toc243184709 \h </w:instrText>
             </w:r>
             <w:r>
               <w:rPr>
@@ -2768,7 +2768,7 @@
               <w14:ligatures w14:val="standardContextual"/>
             </w:rPr>
           </w:pPr>
-          <w:hyperlink w:anchor="_Toc243182359" w:history="1">
+          <w:hyperlink w:anchor="_Toc243184710" w:history="1">
             <w:r>
               <w:rPr>
                 <w:rStyle w:val="Hipervnculo"/>
@@ -2795,7 +2795,7 @@
                 <w:noProof/>
                 <w:webHidden/>
               </w:rPr>
-              <w:instrText xml:space="preserve"> PAGEREF _Toc243182359 \h </w:instrText>
+              <w:instrText xml:space="preserve"> PAGEREF _Toc243184710 \h </w:instrText>
             </w:r>
             <w:r>
               <w:rPr>
@@ -2842,7 +2842,7 @@
               <w14:ligatures w14:val="standardContextual"/>
             </w:rPr>
           </w:pPr>
-          <w:hyperlink w:anchor="_Toc243182360" w:history="1">
+          <w:hyperlink w:anchor="_Toc243184711" w:history="1">
             <w:r>
               <w:rPr>
                 <w:rStyle w:val="Hipervnculo"/>
@@ -2869,7 +2869,7 @@
                 <w:noProof/>
                 <w:webHidden/>
               </w:rPr>
-              <w:instrText xml:space="preserve"> PAGEREF _Toc243182360 \h </w:instrText>
+              <w:instrText xml:space="preserve"> PAGEREF _Toc243184711 \h </w:instrText>
             </w:r>
             <w:r>
               <w:rPr>
@@ -2916,7 +2916,7 @@
               <w14:ligatures w14:val="standardContextual"/>
             </w:rPr>
           </w:pPr>
-          <w:hyperlink w:anchor="_Toc243182361" w:history="1">
+          <w:hyperlink w:anchor="_Toc243184712" w:history="1">
             <w:r>
               <w:rPr>
                 <w:rStyle w:val="Hipervnculo"/>
@@ -2943,7 +2943,7 @@
                 <w:noProof/>
                 <w:webHidden/>
               </w:rPr>
-              <w:instrText xml:space="preserve"> PAGEREF _Toc243182361 \h </w:instrText>
+              <w:instrText xml:space="preserve"> PAGEREF _Toc243184712 \h </w:instrText>
             </w:r>
             <w:r>
               <w:rPr>
@@ -2990,7 +2990,7 @@
               <w14:ligatures w14:val="standardContextual"/>
             </w:rPr>
           </w:pPr>
-          <w:hyperlink w:anchor="_Toc243182362" w:history="1">
+          <w:hyperlink w:anchor="_Toc243184713" w:history="1">
             <w:r>
               <w:rPr>
                 <w:rStyle w:val="Hipervnculo"/>
@@ -3017,7 +3017,7 @@
                 <w:noProof/>
                 <w:webHidden/>
               </w:rPr>
-              <w:instrText xml:space="preserve"> PAGEREF _Toc243182362 \h </w:instrText>
+              <w:instrText xml:space="preserve"> PAGEREF _Toc243184713 \h </w:instrText>
             </w:r>
             <w:r>
               <w:rPr>
@@ -3064,7 +3064,7 @@
               <w14:ligatures w14:val="standardContextual"/>
             </w:rPr>
           </w:pPr>
-          <w:hyperlink w:anchor="_Toc243182363" w:history="1">
+          <w:hyperlink w:anchor="_Toc243184714" w:history="1">
             <w:r>
               <w:rPr>
                 <w:rStyle w:val="Hipervnculo"/>
@@ -3091,7 +3091,7 @@
                 <w:noProof/>
                 <w:webHidden/>
               </w:rPr>
-              <w:instrText xml:space="preserve"> PAGEREF _Toc243182363 \h </w:instrText>
+              <w:instrText xml:space="preserve"> PAGEREF _Toc243184714 \h </w:instrText>
             </w:r>
             <w:r>
               <w:rPr>
@@ -3138,7 +3138,7 @@
               <w14:ligatures w14:val="standardContextual"/>
             </w:rPr>
           </w:pPr>
-          <w:hyperlink w:anchor="_Toc243182364" w:history="1">
+          <w:hyperlink w:anchor="_Toc243184715" w:history="1">
             <w:r>
               <w:rPr>
                 <w:rStyle w:val="Hipervnculo"/>
@@ -3165,7 +3165,7 @@
                 <w:noProof/>
                 <w:webHidden/>
               </w:rPr>
-              <w:instrText xml:space="preserve"> PAGEREF _Toc243182364 \h </w:instrText>
+              <w:instrText xml:space="preserve"> PAGEREF _Toc243184715 \h </w:instrText>
             </w:r>
             <w:r>
               <w:rPr>
@@ -3212,7 +3212,7 @@
               <w14:ligatures w14:val="standardContextual"/>
             </w:rPr>
           </w:pPr>
-          <w:hyperlink w:anchor="_Toc243182365" w:history="1">
+          <w:hyperlink w:anchor="_Toc243184716" w:history="1">
             <w:r>
               <w:rPr>
                 <w:rStyle w:val="Hipervnculo"/>
@@ -3239,7 +3239,7 @@
                 <w:noProof/>
                 <w:webHidden/>
               </w:rPr>
-              <w:instrText xml:space="preserve"> PAGEREF _Toc243182365 \h </w:instrText>
+              <w:instrText xml:space="preserve"> PAGEREF _Toc243184716 \h </w:instrText>
             </w:r>
             <w:r>
               <w:rPr>
@@ -3286,7 +3286,7 @@
               <w14:ligatures w14:val="standardContextual"/>
             </w:rPr>
           </w:pPr>
-          <w:hyperlink w:anchor="_Toc243182366" w:history="1">
+          <w:hyperlink w:anchor="_Toc243184717" w:history="1">
             <w:r>
               <w:rPr>
                 <w:rStyle w:val="Hipervnculo"/>
@@ -3313,7 +3313,7 @@
                 <w:noProof/>
                 <w:webHidden/>
               </w:rPr>
-              <w:instrText xml:space="preserve"> PAGEREF _Toc243182366 \h </w:instrText>
+              <w:instrText xml:space="preserve"> PAGEREF _Toc243184717 \h </w:instrText>
             </w:r>
             <w:r>
               <w:rPr>
@@ -3360,7 +3360,7 @@
               <w14:ligatures w14:val="standardContextual"/>
             </w:rPr>
           </w:pPr>
-          <w:hyperlink w:anchor="_Toc243182367" w:history="1">
+          <w:hyperlink w:anchor="_Toc243184718" w:history="1">
             <w:r>
               <w:rPr>
                 <w:rStyle w:val="Hipervnculo"/>
@@ -3387,7 +3387,7 @@
                 <w:noProof/>
                 <w:webHidden/>
               </w:rPr>
-              <w:instrText xml:space="preserve"> PAGEREF _Toc243182367 \h </w:instrText>
+              <w:instrText xml:space="preserve"> PAGEREF _Toc243184718 \h </w:instrText>
             </w:r>
             <w:r>
               <w:rPr>
@@ -3434,7 +3434,7 @@
               <w14:ligatures w14:val="standardContextual"/>
             </w:rPr>
           </w:pPr>
-          <w:hyperlink w:anchor="_Toc243182368" w:history="1">
+          <w:hyperlink w:anchor="_Toc243184719" w:history="1">
             <w:r>
               <w:rPr>
                 <w:rStyle w:val="Hipervnculo"/>
@@ -3461,7 +3461,7 @@
                 <w:noProof/>
                 <w:webHidden/>
               </w:rPr>
-              <w:instrText xml:space="preserve"> PAGEREF _Toc243182368 \h </w:instrText>
+              <w:instrText xml:space="preserve"> PAGEREF _Toc243184719 \h </w:instrText>
             </w:r>
             <w:r>
               <w:rPr>
@@ -3508,7 +3508,7 @@
               <w14:ligatures w14:val="standardContextual"/>
             </w:rPr>
           </w:pPr>
-          <w:hyperlink w:anchor="_Toc243182369" w:history="1">
+          <w:hyperlink w:anchor="_Toc243184720" w:history="1">
             <w:r>
               <w:rPr>
                 <w:rStyle w:val="Hipervnculo"/>
@@ -3535,7 +3535,7 @@
                 <w:noProof/>
                 <w:webHidden/>
               </w:rPr>
-              <w:instrText xml:space="preserve"> PAGEREF _Toc243182369 \h </w:instrText>
+              <w:instrText xml:space="preserve"> PAGEREF _Toc243184720 \h </w:instrText>
             </w:r>
             <w:r>
               <w:rPr>
@@ -3582,7 +3582,7 @@
               <w14:ligatures w14:val="standardContextual"/>
             </w:rPr>
           </w:pPr>
-          <w:hyperlink w:anchor="_Toc243182370" w:history="1">
+          <w:hyperlink w:anchor="_Toc243184721" w:history="1">
             <w:r>
               <w:rPr>
                 <w:rStyle w:val="Hipervnculo"/>
@@ -3609,7 +3609,7 @@
                 <w:noProof/>
                 <w:webHidden/>
               </w:rPr>
-              <w:instrText xml:space="preserve"> PAGEREF _Toc243182370 \h </w:instrText>
+              <w:instrText xml:space="preserve"> PAGEREF _Toc243184721 \h </w:instrText>
             </w:r>
             <w:r>
               <w:rPr>
@@ -3656,7 +3656,7 @@
               <w14:ligatures w14:val="standardContextual"/>
             </w:rPr>
           </w:pPr>
-          <w:hyperlink w:anchor="_Toc243182371" w:history="1">
+          <w:hyperlink w:anchor="_Toc243184722" w:history="1">
             <w:r>
               <w:rPr>
                 <w:rStyle w:val="Hipervnculo"/>
@@ -3683,7 +3683,7 @@
                 <w:noProof/>
                 <w:webHidden/>
               </w:rPr>
-              <w:instrText xml:space="preserve"> PAGEREF _Toc243182371 \h </w:instrText>
+              <w:instrText xml:space="preserve"> PAGEREF _Toc243184722 \h </w:instrText>
             </w:r>
             <w:r>
               <w:rPr>
@@ -3730,7 +3730,7 @@
               <w14:ligatures w14:val="standardContextual"/>
             </w:rPr>
           </w:pPr>
-          <w:hyperlink w:anchor="_Toc243182372" w:history="1">
+          <w:hyperlink w:anchor="_Toc243184723" w:history="1">
             <w:r>
               <w:rPr>
                 <w:rStyle w:val="Hipervnculo"/>
@@ -3757,7 +3757,7 @@
                 <w:noProof/>
                 <w:webHidden/>
               </w:rPr>
-              <w:instrText xml:space="preserve"> PAGEREF _Toc243182372 \h </w:instrText>
+              <w:instrText xml:space="preserve"> PAGEREF _Toc243184723 \h </w:instrText>
             </w:r>
             <w:r>
               <w:rPr>
@@ -3804,7 +3804,7 @@
               <w14:ligatures w14:val="standardContextual"/>
             </w:rPr>
           </w:pPr>
-          <w:hyperlink w:anchor="_Toc243182373" w:history="1">
+          <w:hyperlink w:anchor="_Toc243184724" w:history="1">
             <w:r>
               <w:rPr>
                 <w:rStyle w:val="Hipervnculo"/>
@@ -3831,7 +3831,7 @@
                 <w:noProof/>
                 <w:webHidden/>
               </w:rPr>
-              <w:instrText xml:space="preserve"> PAGEREF _Toc243182373 \h </w:instrText>
+              <w:instrText xml:space="preserve"> PAGEREF _Toc243184724 \h </w:instrText>
             </w:r>
             <w:r>
               <w:rPr>
@@ -3878,7 +3878,7 @@
               <w14:ligatures w14:val="standardContextual"/>
             </w:rPr>
           </w:pPr>
-          <w:hyperlink w:anchor="_Toc243182374" w:history="1">
+          <w:hyperlink w:anchor="_Toc243184725" w:history="1">
             <w:r>
               <w:rPr>
                 <w:rStyle w:val="Hipervnculo"/>
@@ -3905,7 +3905,7 @@
                 <w:noProof/>
                 <w:webHidden/>
               </w:rPr>
-              <w:instrText xml:space="preserve"> PAGEREF _Toc243182374 \h </w:instrText>
+              <w:instrText xml:space="preserve"> PAGEREF _Toc243184725 \h </w:instrText>
             </w:r>
             <w:r>
               <w:rPr>
@@ -3952,7 +3952,7 @@
               <w14:ligatures w14:val="standardContextual"/>
             </w:rPr>
           </w:pPr>
-          <w:hyperlink w:anchor="_Toc243182375" w:history="1">
+          <w:hyperlink w:anchor="_Toc243184726" w:history="1">
             <w:r>
               <w:rPr>
                 <w:rStyle w:val="Hipervnculo"/>
@@ -3979,7 +3979,7 @@
                 <w:noProof/>
                 <w:webHidden/>
               </w:rPr>
-              <w:instrText xml:space="preserve"> PAGEREF _Toc243182375 \h </w:instrText>
+              <w:instrText xml:space="preserve"> PAGEREF _Toc243184726 \h </w:instrText>
             </w:r>
             <w:r>
               <w:rPr>
@@ -4026,7 +4026,7 @@
               <w14:ligatures w14:val="standardContextual"/>
             </w:rPr>
           </w:pPr>
-          <w:hyperlink w:anchor="_Toc243182376" w:history="1">
+          <w:hyperlink w:anchor="_Toc243184727" w:history="1">
             <w:r>
               <w:rPr>
                 <w:rStyle w:val="Hipervnculo"/>
@@ -4053,7 +4053,7 @@
                 <w:noProof/>
                 <w:webHidden/>
               </w:rPr>
-              <w:instrText xml:space="preserve"> PAGEREF _Toc243182376 \h </w:instrText>
+              <w:instrText xml:space="preserve"> PAGEREF _Toc243184727 \h </w:instrText>
             </w:r>
             <w:r>
               <w:rPr>
@@ -4100,7 +4100,7 @@
               <w14:ligatures w14:val="standardContextual"/>
             </w:rPr>
           </w:pPr>
-          <w:hyperlink w:anchor="_Toc243182377" w:history="1">
+          <w:hyperlink w:anchor="_Toc243184728" w:history="1">
             <w:r>
               <w:rPr>
                 <w:rStyle w:val="Hipervnculo"/>
@@ -4127,7 +4127,7 @@
                 <w:noProof/>
                 <w:webHidden/>
               </w:rPr>
-              <w:instrText xml:space="preserve"> PAGEREF _Toc243182377 \h </w:instrText>
+              <w:instrText xml:space="preserve"> PAGEREF _Toc243184728 \h </w:instrText>
             </w:r>
             <w:r>
               <w:rPr>
@@ -4174,7 +4174,7 @@
               <w14:ligatures w14:val="standardContextual"/>
             </w:rPr>
           </w:pPr>
-          <w:hyperlink w:anchor="_Toc243182378" w:history="1">
+          <w:hyperlink w:anchor="_Toc243184729" w:history="1">
             <w:r>
               <w:rPr>
                 <w:rStyle w:val="Hipervnculo"/>
@@ -4201,7 +4201,7 @@
                 <w:noProof/>
                 <w:webHidden/>
               </w:rPr>
-              <w:instrText xml:space="preserve"> PAGEREF _Toc243182378 \h </w:instrText>
+              <w:instrText xml:space="preserve"> PAGEREF _Toc243184729 \h </w:instrText>
             </w:r>
             <w:r>
               <w:rPr>
@@ -4248,7 +4248,7 @@
               <w14:ligatures w14:val="standardContextual"/>
             </w:rPr>
           </w:pPr>
-          <w:hyperlink w:anchor="_Toc243182379" w:history="1">
+          <w:hyperlink w:anchor="_Toc243184730" w:history="1">
             <w:r>
               <w:rPr>
                 <w:rStyle w:val="Hipervnculo"/>
@@ -4275,7 +4275,7 @@
                 <w:noProof/>
                 <w:webHidden/>
               </w:rPr>
-              <w:instrText xml:space="preserve"> PAGEREF _Toc243182379 \h </w:instrText>
+              <w:instrText xml:space="preserve"> PAGEREF _Toc243184730 \h </w:instrText>
             </w:r>
             <w:r>
               <w:rPr>
@@ -4322,7 +4322,7 @@
               <w14:ligatures w14:val="standardContextual"/>
             </w:rPr>
           </w:pPr>
-          <w:hyperlink w:anchor="_Toc243182380" w:history="1">
+          <w:hyperlink w:anchor="_Toc243184731" w:history="1">
             <w:r>
               <w:rPr>
                 <w:rStyle w:val="Hipervnculo"/>
@@ -4349,7 +4349,7 @@
                 <w:noProof/>
                 <w:webHidden/>
               </w:rPr>
-              <w:instrText xml:space="preserve"> PAGEREF _Toc243182380 \h </w:instrText>
+              <w:instrText xml:space="preserve"> PAGEREF _Toc243184731 \h </w:instrText>
             </w:r>
             <w:r>
               <w:rPr>
@@ -4396,7 +4396,7 @@
               <w14:ligatures w14:val="standardContextual"/>
             </w:rPr>
           </w:pPr>
-          <w:hyperlink w:anchor="_Toc243182381" w:history="1">
+          <w:hyperlink w:anchor="_Toc243184732" w:history="1">
             <w:r>
               <w:rPr>
                 <w:rStyle w:val="Hipervnculo"/>
@@ -4423,7 +4423,7 @@
                 <w:noProof/>
                 <w:webHidden/>
               </w:rPr>
-              <w:instrText xml:space="preserve"> PAGEREF _Toc243182381 \h </w:instrText>
+              <w:instrText xml:space="preserve"> PAGEREF _Toc243184732 \h </w:instrText>
             </w:r>
             <w:r>
               <w:rPr>
@@ -4470,7 +4470,7 @@
               <w14:ligatures w14:val="standardContextual"/>
             </w:rPr>
           </w:pPr>
-          <w:hyperlink w:anchor="_Toc243182382" w:history="1">
+          <w:hyperlink w:anchor="_Toc243184733" w:history="1">
             <w:r>
               <w:rPr>
                 <w:rStyle w:val="Hipervnculo"/>
@@ -4497,7 +4497,7 @@
                 <w:noProof/>
                 <w:webHidden/>
               </w:rPr>
-              <w:instrText xml:space="preserve"> PAGEREF _Toc243182382 \h </w:instrText>
+              <w:instrText xml:space="preserve"> PAGEREF _Toc243184733 \h </w:instrText>
             </w:r>
             <w:r>
               <w:rPr>
@@ -4544,7 +4544,7 @@
               <w14:ligatures w14:val="standardContextual"/>
             </w:rPr>
           </w:pPr>
-          <w:hyperlink w:anchor="_Toc243182383" w:history="1">
+          <w:hyperlink w:anchor="_Toc243184734" w:history="1">
             <w:r>
               <w:rPr>
                 <w:rStyle w:val="Hipervnculo"/>
@@ -4571,7 +4571,7 @@
                 <w:noProof/>
                 <w:webHidden/>
               </w:rPr>
-              <w:instrText xml:space="preserve"> PAGEREF _Toc243182383 \h </w:instrText>
+              <w:instrText xml:space="preserve"> PAGEREF _Toc243184734 \h </w:instrText>
             </w:r>
             <w:r>
               <w:rPr>
@@ -4618,7 +4618,7 @@
               <w14:ligatures w14:val="standardContextual"/>
             </w:rPr>
           </w:pPr>
-          <w:hyperlink w:anchor="_Toc243182384" w:history="1">
+          <w:hyperlink w:anchor="_Toc243184735" w:history="1">
             <w:r>
               <w:rPr>
                 <w:rStyle w:val="Hipervnculo"/>
@@ -4645,7 +4645,7 @@
                 <w:noProof/>
                 <w:webHidden/>
               </w:rPr>
-              <w:instrText xml:space="preserve"> PAGEREF _Toc243182384 \h </w:instrText>
+              <w:instrText xml:space="preserve"> PAGEREF _Toc243184735 \h </w:instrText>
             </w:r>
             <w:r>
               <w:rPr>
@@ -4693,7 +4693,7 @@
         <w:pStyle w:val="Ttulo1"/>
       </w:pPr>
       <w:bookmarkStart w:id="0" w:name="sobre-este-documento"/>
-      <w:bookmarkStart w:id="1" w:name="_Toc243182323"/>
+      <w:bookmarkStart w:id="1" w:name="_Toc243184674"/>
       <w:r>
         <w:t>Sobre este documento</w:t>
       </w:r>
@@ -4856,10 +4856,7 @@
         <w:t>documento de diseño técnico</w:t>
       </w:r>
       <w:r>
-        <w:t xml:space="preserve">. Combina tres plantillas: visión general del sistema, diseño de arquitectura, y pruebas y validación. Sobre esa base agrega, en el orden del enunciado, las </w:t>
-      </w:r>
-      <w:r>
-        <w:t xml:space="preserve">secciones propias de un sistema inteligente. Su diseño editorial está en </w:t>
+        <w:t xml:space="preserve">. Combina tres plantillas: visión general del sistema, diseño de arquitectura, y pruebas y validación. Sobre esa base agrega, en el orden del enunciado, las secciones propias de un sistema inteligente. Su diseño editorial está en </w:t>
       </w:r>
       <w:r>
         <w:rPr>
@@ -4947,7 +4944,7 @@
         <w:pStyle w:val="Ttulo1"/>
       </w:pPr>
       <w:bookmarkStart w:id="2" w:name="introducción-y-alcance"/>
-      <w:bookmarkStart w:id="3" w:name="_Toc243182324"/>
+      <w:bookmarkStart w:id="3" w:name="_Toc243184675"/>
       <w:bookmarkEnd w:id="0"/>
       <w:r>
         <w:t>1. Introducción y alcance</w:t>
@@ -4959,7 +4956,7 @@
         <w:pStyle w:val="Ttulo2"/>
       </w:pPr>
       <w:bookmarkStart w:id="4" w:name="pregunta-central"/>
-      <w:bookmarkStart w:id="5" w:name="_Toc243182325"/>
+      <w:bookmarkStart w:id="5" w:name="_Toc243184676"/>
       <w:r>
         <w:t>1.1. Pregunta central</w:t>
       </w:r>
@@ -4978,10 +4975,7 @@
         <w:t>Pregunta central:</w:t>
       </w:r>
       <w:r>
-        <w:t xml:space="preserve"> ¿Cómo cambia la forma de decidir de un sistema inteligente cuando pasa de encontrar una </w:t>
-      </w:r>
-      <w:r>
-        <w:t>ruta, a optimizar su costo, utilizar conocimiento heurístico y finalmente actuar frente a un adversario que también toma decisiones?</w:t>
+        <w:t xml:space="preserve"> ¿Cómo cambia la forma de decidir de un sistema inteligente cuando pasa de encontrar una ruta, a optimizar su costo, utilizar conocimiento heurístico y finalmente actuar frente a un adversario que también toma decisiones?</w:t>
       </w:r>
     </w:p>
     <w:p>
@@ -5072,7 +5066,7 @@
         <w:pStyle w:val="Ttulo2"/>
       </w:pPr>
       <w:bookmarkStart w:id="6" w:name="metas-del-sistema"/>
-      <w:bookmarkStart w:id="7" w:name="_Toc243182326"/>
+      <w:bookmarkStart w:id="7" w:name="_Toc243184677"/>
       <w:bookmarkEnd w:id="4"/>
       <w:r>
         <w:t>1.2. Metas del sistema</w:t>
@@ -5133,10 +5127,7 @@
         <w:t>Resolver y decidir:</w:t>
       </w:r>
       <w:r>
-        <w:t xml:space="preserve"> navegar con cinco algoritmos de búsqueda y elegir jugadas con Minimax y alfa-beta, con </w:t>
-      </w:r>
-      <w:r>
-        <w:t>métricas comparables.</w:t>
+        <w:t xml:space="preserve"> navegar con cinco algoritmos de búsqueda y elegir jugadas con Minimax y alfa-beta, con métricas comparables.</w:t>
       </w:r>
     </w:p>
     <w:p>
@@ -5182,7 +5173,7 @@
         <w:pStyle w:val="Ttulo2"/>
       </w:pPr>
       <w:bookmarkStart w:id="8" w:name="alcance"/>
-      <w:bookmarkStart w:id="9" w:name="_Toc243182327"/>
+      <w:bookmarkStart w:id="9" w:name="_Toc243184678"/>
       <w:bookmarkEnd w:id="6"/>
       <w:r>
         <w:t>1.3. Alcance</w:t>
@@ -5243,10 +5234,7 @@
         <w:t>Fuera de alcance:</w:t>
       </w:r>
       <w:r>
-        <w:t xml:space="preserve"> </w:t>
-      </w:r>
-      <w:r>
-        <w:t>combate, puntos de vida o eliminación de unidades; concurrencia o tiempo real; calidad artística de la interfaz.</w:t>
+        <w:t xml:space="preserve"> combate, puntos de vida o eliminación de unidades; concurrencia o tiempo real; calidad artística de la interfaz.</w:t>
       </w:r>
     </w:p>
     <w:p>
@@ -5254,7 +5242,7 @@
         <w:pStyle w:val="Ttulo2"/>
       </w:pPr>
       <w:bookmarkStart w:id="10" w:name="matriz-de-cumplimiento-del-enunciado"/>
-      <w:bookmarkStart w:id="11" w:name="_Toc243182328"/>
+      <w:bookmarkStart w:id="11" w:name="_Toc243184679"/>
       <w:bookmarkEnd w:id="8"/>
       <w:r>
         <w:t>1.4. Matriz de cumplimiento del enunciado</w:t>
@@ -6318,7 +6306,7 @@
         <w:pStyle w:val="Ttulo1"/>
       </w:pPr>
       <w:bookmarkStart w:id="12" w:name="visión-general-y-arquitectura"/>
-      <w:bookmarkStart w:id="13" w:name="_Toc243182329"/>
+      <w:bookmarkStart w:id="13" w:name="_Toc243184680"/>
       <w:bookmarkEnd w:id="2"/>
       <w:bookmarkEnd w:id="10"/>
       <w:r>
@@ -6331,7 +6319,7 @@
         <w:pStyle w:val="Ttulo2"/>
       </w:pPr>
       <w:bookmarkStart w:id="14" w:name="capas"/>
-      <w:bookmarkStart w:id="15" w:name="_Toc243182330"/>
+      <w:bookmarkStart w:id="15" w:name="_Toc243184681"/>
       <w:r>
         <w:t>2.1. Capas</w:t>
       </w:r>
@@ -7001,7 +6989,7 @@
         <w:pStyle w:val="Ttulo2"/>
       </w:pPr>
       <w:bookmarkStart w:id="16" w:name="flujo-de-datos"/>
-      <w:bookmarkStart w:id="17" w:name="_Toc243182331"/>
+      <w:bookmarkStart w:id="17" w:name="_Toc243184682"/>
       <w:bookmarkEnd w:id="14"/>
       <w:r>
         <w:t>2.2. Flujo de datos</w:t>
@@ -7159,7 +7147,7 @@
         <w:pStyle w:val="Ttulo2"/>
       </w:pPr>
       <w:bookmarkStart w:id="18" w:name="recorrido-del-usuario"/>
-      <w:bookmarkStart w:id="19" w:name="_Toc243182332"/>
+      <w:bookmarkStart w:id="19" w:name="_Toc243184683"/>
       <w:bookmarkEnd w:id="16"/>
       <w:r>
         <w:t>2.3. Recorrido del usuario</w:t>
@@ -7354,7 +7342,7 @@
         <w:pStyle w:val="Ttulo2"/>
       </w:pPr>
       <w:bookmarkStart w:id="20" w:name="stack-técnico"/>
-      <w:bookmarkStart w:id="21" w:name="_Toc243182333"/>
+      <w:bookmarkStart w:id="21" w:name="_Toc243184684"/>
       <w:bookmarkEnd w:id="18"/>
       <w:r>
         <w:t>2.4. Stack técnico</w:t>
@@ -7510,7 +7498,7 @@
         <w:pStyle w:val="Ttulo1"/>
       </w:pPr>
       <w:bookmarkStart w:id="22" w:name="modelado-del-problema"/>
-      <w:bookmarkStart w:id="23" w:name="_Toc243182334"/>
+      <w:bookmarkStart w:id="23" w:name="_Toc243184685"/>
       <w:bookmarkEnd w:id="12"/>
       <w:bookmarkEnd w:id="20"/>
       <w:r>
@@ -7531,7 +7519,7 @@
         <w:pStyle w:val="Ttulo2"/>
       </w:pPr>
       <w:bookmarkStart w:id="24" w:name="navegación"/>
-      <w:bookmarkStart w:id="25" w:name="_Toc243182335"/>
+      <w:bookmarkStart w:id="25" w:name="_Toc243184686"/>
       <w:r>
         <w:t>3.1. Navegación</w:t>
       </w:r>
@@ -7623,10 +7611,7 @@
         <w:t>una</w:t>
       </w:r>
       <w:r>
-        <w:t xml:space="preserve"> </w:t>
-      </w:r>
-      <w:r>
-        <w:t>unidad fija. Una celda ortogonal, en el orden arriba, abajo, izquierda, derecha, hacia una celda dentro del mapa y transitable.</w:t>
+        <w:t xml:space="preserve"> unidad fija. Una celda ortogonal, en el orden arriba, abajo, izquierda, derecha, hacia una celda dentro del mapa y transitable.</w:t>
       </w:r>
     </w:p>
     <w:p>
@@ -7745,10 +7730,7 @@
         <w:t>Nota:</w:t>
       </w:r>
       <w:r>
-        <w:t xml:space="preserve"> </w:t>
-      </w:r>
-      <w:r>
-        <w:t>En navegación se ignora al adversario, como pide el enunciado. El turno no cambia y las demás unidades no bloquean.</w:t>
+        <w:t xml:space="preserve"> En navegación se ignora al adversario, como pide el enunciado. El turno no cambia y las demás unidades no bloquean.</w:t>
       </w:r>
     </w:p>
     <w:p>
@@ -7756,7 +7738,7 @@
         <w:pStyle w:val="Ttulo2"/>
       </w:pPr>
       <w:bookmarkStart w:id="26" w:name="partida-adversarial"/>
-      <w:bookmarkStart w:id="27" w:name="_Toc243182336"/>
+      <w:bookmarkStart w:id="27" w:name="_Toc243184687"/>
       <w:bookmarkEnd w:id="24"/>
       <w:r>
         <w:t>3.2. Partida adversarial</w:t>
@@ -7854,10 +7836,7 @@
         <w:t>aplicar_accion</w:t>
       </w:r>
       <w:r>
-        <w:t xml:space="preserve"> </w:t>
-      </w:r>
-      <w:r>
-        <w:t>valida, aplica y alterna el turno una sola vez.</w:t>
+        <w:t xml:space="preserve"> valida, aplica y alterna el turno una sola vez.</w:t>
       </w:r>
     </w:p>
     <w:p>
@@ -7940,7 +7919,7 @@
         <w:pStyle w:val="Ttulo1"/>
       </w:pPr>
       <w:bookmarkStart w:id="28" w:name="representación-de-estados"/>
-      <w:bookmarkStart w:id="29" w:name="_Toc243182337"/>
+      <w:bookmarkStart w:id="29" w:name="_Toc243184688"/>
       <w:bookmarkEnd w:id="22"/>
       <w:bookmarkEnd w:id="26"/>
       <w:r>
@@ -7953,7 +7932,7 @@
         <w:pStyle w:val="Ttulo2"/>
       </w:pPr>
       <w:bookmarkStart w:id="30" w:name="lo-estático-y-lo-dinámico"/>
-      <w:bookmarkStart w:id="31" w:name="_Toc243182338"/>
+      <w:bookmarkStart w:id="31" w:name="_Toc243184689"/>
       <w:r>
         <w:t>4.1. Lo estático y lo dinámico</w:t>
       </w:r>
@@ -8268,7 +8247,7 @@
         <w:pStyle w:val="Ttulo2"/>
       </w:pPr>
       <w:bookmarkStart w:id="32" w:name="por-qué-la-representación-es-suficiente"/>
-      <w:bookmarkStart w:id="33" w:name="_Toc243182339"/>
+      <w:bookmarkStart w:id="33" w:name="_Toc243184690"/>
       <w:bookmarkEnd w:id="30"/>
       <w:r>
         <w:t>4.2. Por qué la representación es suficiente</w:t>
@@ -8299,10 +8278,7 @@
         <w:t>Posiciones de todas las unidades:</w:t>
       </w:r>
       <w:r>
-        <w:t xml:space="preserve"> </w:t>
-      </w:r>
-      <w:r>
-        <w:t>definen los movimientos legales, porque una celda ocupada no es un destino válido, y las intercepciones posibles, por adyacencia al portador.</w:t>
+        <w:t xml:space="preserve"> definen los movimientos legales, porque una celda ocupada no es un destino válido, y las intercepciones posibles, por adyacencia al portador.</w:t>
       </w:r>
     </w:p>
     <w:p>
@@ -8412,7 +8388,7 @@
         <w:pStyle w:val="Ttulo2"/>
       </w:pPr>
       <w:bookmarkStart w:id="34" w:name="estado-compuesto-caso-mínimo-6"/>
-      <w:bookmarkStart w:id="35" w:name="_Toc243182340"/>
+      <w:bookmarkStart w:id="35" w:name="_Toc243184691"/>
       <w:bookmarkEnd w:id="32"/>
       <w:r>
         <w:t>4.3. Estado compuesto (caso mínimo 6)</w:t>
@@ -8502,10 +8478,7 @@
         <w:t>avanzar</w:t>
       </w:r>
       <w:r>
-        <w:t xml:space="preserve"> </w:t>
-      </w:r>
-      <w:r>
-        <w:t>en el segundo, en las profundidades 1 a 4.</w:t>
+        <w:t xml:space="preserve"> en el segundo, en las profundidades 1 a 4.</w:t>
       </w:r>
     </w:p>
     <w:p>
@@ -8550,7 +8523,7 @@
         <w:pStyle w:val="Ttulo1"/>
       </w:pPr>
       <w:bookmarkStart w:id="36" w:name="reglas-del-juego"/>
-      <w:bookmarkStart w:id="37" w:name="_Toc243182341"/>
+      <w:bookmarkStart w:id="37" w:name="_Toc243184692"/>
       <w:bookmarkEnd w:id="28"/>
       <w:bookmarkEnd w:id="34"/>
       <w:r>
@@ -8563,7 +8536,7 @@
         <w:pStyle w:val="Ttulo2"/>
       </w:pPr>
       <w:bookmarkStart w:id="38" w:name="mecánicas"/>
-      <w:bookmarkStart w:id="39" w:name="_Toc243182342"/>
+      <w:bookmarkStart w:id="39" w:name="_Toc243184693"/>
       <w:r>
         <w:t>5.1. Mecánicas</w:t>
       </w:r>
@@ -8652,10 +8625,7 @@
         <w:t>Recoger:</w:t>
       </w:r>
       <w:r>
-        <w:t xml:space="preserve"> </w:t>
-      </w:r>
-      <w:r>
-        <w:t>al entrar en la celda del recurso libre, la unidad lo recoge. Pasar junto a él no lo recoge.</w:t>
+        <w:t xml:space="preserve"> al entrar en la celda del recurso libre, la unidad lo recoge. Pasar junto a él no lo recoge.</w:t>
       </w:r>
     </w:p>
     <w:p>
@@ -8766,7 +8736,7 @@
         <w:pStyle w:val="Ttulo2"/>
       </w:pPr>
       <w:bookmarkStart w:id="40" w:name="reglas-deterministas-de-borde"/>
-      <w:bookmarkStart w:id="41" w:name="_Toc243182343"/>
+      <w:bookmarkStart w:id="41" w:name="_Toc243184694"/>
       <w:bookmarkEnd w:id="38"/>
       <w:r>
         <w:t>5.2. Reglas deterministas de borde</w:t>
@@ -8844,10 +8814,7 @@
         <w:t>Ambos bandos bloqueados:</w:t>
       </w:r>
       <w:r>
-        <w:t xml:space="preserve"> la partida termina en</w:t>
-      </w:r>
-      <w:r>
-        <w:t xml:space="preserve"> </w:t>
+        <w:t xml:space="preserve"> la partida termina en </w:t>
       </w:r>
       <w:r>
         <w:rPr>
@@ -8965,7 +8932,7 @@
         <w:pStyle w:val="Ttulo2"/>
       </w:pPr>
       <w:bookmarkStart w:id="42" w:name="tácticas"/>
-      <w:bookmarkStart w:id="43" w:name="_Toc243182344"/>
+      <w:bookmarkStart w:id="43" w:name="_Toc243184695"/>
       <w:bookmarkEnd w:id="40"/>
       <w:r>
         <w:t>5.3. Tácticas</w:t>
@@ -9065,10 +9032,7 @@
         <w:t>Nota:</w:t>
       </w:r>
       <w:r>
-        <w:t xml:space="preserve"> </w:t>
-      </w:r>
-      <w:r>
-        <w:t xml:space="preserve">La clasificación explica las decisiones y define el orden </w:t>
+        <w:t xml:space="preserve"> La clasificación explica las decisiones y define el orden </w:t>
       </w:r>
       <w:r>
         <w:rPr>
@@ -9096,7 +9060,7 @@
         <w:pStyle w:val="Ttulo1"/>
       </w:pPr>
       <w:bookmarkStart w:id="44" w:name="costos"/>
-      <w:bookmarkStart w:id="45" w:name="_Toc243182345"/>
+      <w:bookmarkStart w:id="45" w:name="_Toc243184696"/>
       <w:bookmarkEnd w:id="36"/>
       <w:bookmarkEnd w:id="42"/>
       <w:r>
@@ -9195,10 +9159,7 @@
         <w:t>ProblemaNavegacion</w:t>
       </w:r>
       <w:r>
-        <w:t xml:space="preserve"> </w:t>
-      </w:r>
-      <w:r>
-        <w:t>calcula una vez el menor costo transitable. Las heurísticas lo usan como escala, y así siguen siendo admisibles aunque haya costos menores que 1.</w:t>
+        <w:t xml:space="preserve"> calcula una vez el menor costo transitable. Las heurísticas lo usan como escala, y así siguen siendo admisibles aunque haya costos menores que 1.</w:t>
       </w:r>
     </w:p>
     <w:p>
@@ -9262,7 +9223,7 @@
         <w:pStyle w:val="Ttulo1"/>
       </w:pPr>
       <w:bookmarkStart w:id="46" w:name="algoritmos-de-búsqueda"/>
-      <w:bookmarkStart w:id="47" w:name="_Toc243182346"/>
+      <w:bookmarkStart w:id="47" w:name="_Toc243184697"/>
       <w:bookmarkEnd w:id="44"/>
       <w:r>
         <w:t>7. Algoritmos de búsqueda</w:t>
@@ -10103,7 +10064,7 @@
         <w:pStyle w:val="Ttulo1"/>
       </w:pPr>
       <w:bookmarkStart w:id="48" w:name="heurísticas"/>
-      <w:bookmarkStart w:id="49" w:name="_Toc243182347"/>
+      <w:bookmarkStart w:id="49" w:name="_Toc243184698"/>
       <w:bookmarkEnd w:id="46"/>
       <w:r>
         <w:t>8. Heurísticas</w:t>
@@ -10115,7 +10076,7 @@
         <w:pStyle w:val="Ttulo2"/>
       </w:pPr>
       <w:bookmarkStart w:id="50" w:name="manhattan-escalada-e6.1"/>
-      <w:bookmarkStart w:id="51" w:name="_Toc243182348"/>
+      <w:bookmarkStart w:id="51" w:name="_Toc243184699"/>
       <w:r>
         <w:t>8.1. Manhattan escalada (E6.1)</w:t>
       </w:r>
@@ -10137,7 +10098,7 @@
         <w:pStyle w:val="Ttulo2"/>
       </w:pPr>
       <w:bookmarkStart w:id="52" w:name="distancia-con-obstáculos-hto-e6.2-propia"/>
-      <w:bookmarkStart w:id="53" w:name="_Toc243182349"/>
+      <w:bookmarkStart w:id="53" w:name="_Toc243184700"/>
       <w:bookmarkEnd w:id="50"/>
       <w:r>
         <w:t>8.2. Distancia con obstáculos, HTO (E6.2, propia)</w:t>
@@ -10185,10 +10146,7 @@
         <w:t>respetando los muros</w:t>
       </w:r>
       <w:r>
-        <w:t xml:space="preserve">. Se calcula una </w:t>
-      </w:r>
-      <w:r>
-        <w:t xml:space="preserve">sola vez por problema, con un BFS inverso desde el objetivo. Cada consulta cuesta O(1) promedio, más O(U) para localizar la unidad. Se usa desde la API: </w:t>
+        <w:t xml:space="preserve">. Se calcula una sola vez por problema, con un BFS inverso desde el objetivo. Cada consulta cuesta O(1) promedio, más O(U) para localizar la unidad. Se usa desde la API: </w:t>
       </w:r>
       <w:r>
         <w:rPr>
@@ -10205,7 +10163,7 @@
         <w:pStyle w:val="Ttulo2"/>
       </w:pPr>
       <w:bookmarkStart w:id="54" w:name="las-cinco-preguntas-del-enunciado"/>
-      <w:bookmarkStart w:id="55" w:name="_Toc243182350"/>
+      <w:bookmarkStart w:id="55" w:name="_Toc243184701"/>
       <w:bookmarkEnd w:id="52"/>
       <w:r>
         <w:t>8.3. Las cinco preguntas del enunciado</w:t>
@@ -10665,13 +10623,7 @@
               <w:rPr>
                 <w:sz w:val="17"/>
               </w:rPr>
-              <w:t xml:space="preserve"> </w:t>
-            </w:r>
-            <w:r>
-              <w:rPr>
-                <w:sz w:val="17"/>
-              </w:rPr>
-              <w:t>baja las expansiones de 33 a 26. Pierde en mapas abiertos, donde coincide con Manhattan y solo agrega preparación. No distingue terrenos caros de baratos.</w:t>
+              <w:t xml:space="preserve"> baja las expansiones de 33 a 26. Pierde en mapas abiertos, donde coincide con Manhattan y solo agrega preparación. No distingue terrenos caros de baratos.</w:t>
             </w:r>
           </w:p>
         </w:tc>
@@ -10718,7 +10670,7 @@
         <w:pStyle w:val="Ttulo1"/>
       </w:pPr>
       <w:bookmarkStart w:id="56" w:name="Xc460eedbd2461790e1bf2cbac354ded6450a312"/>
-      <w:bookmarkStart w:id="57" w:name="_Toc243182351"/>
+      <w:bookmarkStart w:id="57" w:name="_Toc243184702"/>
       <w:bookmarkEnd w:id="48"/>
       <w:bookmarkEnd w:id="54"/>
       <w:r>
@@ -10731,7 +10683,7 @@
         <w:pStyle w:val="Ttulo2"/>
       </w:pPr>
       <w:bookmarkStart w:id="58" w:name="max-min-y-suma-cero"/>
-      <w:bookmarkStart w:id="59" w:name="_Toc243182352"/>
+      <w:bookmarkStart w:id="59" w:name="_Toc243184703"/>
       <w:r>
         <w:t>9.1. MAX, MIN y suma cero</w:t>
       </w:r>
@@ -10773,10 +10725,7 @@
         <w:t>Importante:</w:t>
       </w:r>
       <w:r>
-        <w:t xml:space="preserve"> MIN no está en desventaja. Usa las mismas acciones, las mismas reglas y la misma función. Minimizar la utilidad de MAX equivale a maximizar la suya. Las pruebas lo comprueban reflejando el tablero e </w:t>
-      </w:r>
-      <w:r>
-        <w:t>intercambiando los bandos: quien mueve obtiene el mismo valor.</w:t>
+        <w:t xml:space="preserve"> MIN no está en desventaja. Usa las mismas acciones, las mismas reglas y la misma función. Minimizar la utilidad de MAX equivale a maximizar la suya. Las pruebas lo comprueban reflejando el tablero e intercambiando los bandos: quien mueve obtiene el mismo valor.</w:t>
       </w:r>
     </w:p>
     <w:p>
@@ -10784,7 +10733,7 @@
         <w:pStyle w:val="Ttulo2"/>
       </w:pPr>
       <w:bookmarkStart w:id="60" w:name="criterios-y-pesos"/>
-      <w:bookmarkStart w:id="61" w:name="_Toc243182353"/>
+      <w:bookmarkStart w:id="61" w:name="_Toc243184704"/>
       <w:bookmarkEnd w:id="58"/>
       <w:r>
         <w:t>9.2. Criterios y pesos</w:t>
@@ -11506,7 +11455,7 @@
         <w:pStyle w:val="Ttulo2"/>
       </w:pPr>
       <w:bookmarkStart w:id="62" w:name="minimax-con-profundidad-limitada"/>
-      <w:bookmarkStart w:id="63" w:name="_Toc243182354"/>
+      <w:bookmarkStart w:id="63" w:name="_Toc243184705"/>
       <w:bookmarkEnd w:id="60"/>
       <w:r>
         <w:t>9.3. Minimax con profundidad limitada</w:t>
@@ -11542,10 +11491,7 @@
         <w:t>juego.profundidad_maxima_minimax</w:t>
       </w:r>
       <w:r>
-        <w:t xml:space="preserve"> </w:t>
-      </w:r>
-      <w:r>
-        <w:t xml:space="preserve">o de </w:t>
+        <w:t xml:space="preserve"> o de </w:t>
       </w:r>
       <w:r>
         <w:rPr>
@@ -11572,7 +11518,7 @@
         <w:pStyle w:val="Ttulo2"/>
       </w:pPr>
       <w:bookmarkStart w:id="64" w:name="poda-alfa-beta"/>
-      <w:bookmarkStart w:id="65" w:name="_Toc243182355"/>
+      <w:bookmarkStart w:id="65" w:name="_Toc243184706"/>
       <w:bookmarkEnd w:id="62"/>
       <w:r>
         <w:t>9.4. Poda alfa-beta</w:t>
@@ -11600,10 +11546,7 @@
         <w:t>fail-soft</w:t>
       </w:r>
       <w:r>
-        <w:t xml:space="preserve"> </w:t>
-      </w:r>
-      <w:r>
-        <w:t xml:space="preserve">y el mismo desempate que Minimax, así que </w:t>
+        <w:t xml:space="preserve"> y el mismo desempate que Minimax, así que </w:t>
       </w:r>
       <w:r>
         <w:rPr>
@@ -11621,7 +11564,7 @@
         <w:pStyle w:val="Ttulo2"/>
       </w:pPr>
       <w:bookmarkStart w:id="66" w:name="orden-de-las-acciones"/>
-      <w:bookmarkStart w:id="67" w:name="_Toc243182356"/>
+      <w:bookmarkStart w:id="67" w:name="_Toc243184707"/>
       <w:bookmarkEnd w:id="64"/>
       <w:r>
         <w:t>9.5. Orden de las acciones</w:t>
@@ -11765,7 +11708,7 @@
         <w:pStyle w:val="Ttulo1"/>
       </w:pPr>
       <w:bookmarkStart w:id="68" w:name="escenarios-validación-y-verificación"/>
-      <w:bookmarkStart w:id="69" w:name="_Toc243182357"/>
+      <w:bookmarkStart w:id="69" w:name="_Toc243184708"/>
       <w:bookmarkEnd w:id="56"/>
       <w:bookmarkEnd w:id="66"/>
       <w:r>
@@ -11778,7 +11721,7 @@
         <w:pStyle w:val="Ttulo2"/>
       </w:pPr>
       <w:bookmarkStart w:id="70" w:name="formato-json-común"/>
-      <w:bookmarkStart w:id="71" w:name="_Toc243182358"/>
+      <w:bookmarkStart w:id="71" w:name="_Toc243184709"/>
       <w:r>
         <w:t>10.1. Formato JSON común</w:t>
       </w:r>
@@ -12130,7 +12073,7 @@
         <w:pStyle w:val="Ttulo2"/>
       </w:pPr>
       <w:bookmarkStart w:id="72" w:name="validación-atómica"/>
-      <w:bookmarkStart w:id="73" w:name="_Toc243182359"/>
+      <w:bookmarkStart w:id="73" w:name="_Toc243184710"/>
       <w:bookmarkEnd w:id="70"/>
       <w:r>
         <w:t>10.2. Validación atómica</w:t>
@@ -12292,10 +12235,7 @@
         <w:t>Nota:</w:t>
       </w:r>
       <w:r>
-        <w:t xml:space="preserve"> </w:t>
-      </w:r>
-      <w:r>
-        <w:t>Nada se aplica hasta validar todo. Una carga fallida no altera el escenario vigente.</w:t>
+        <w:t xml:space="preserve"> Nada se aplica hasta validar todo. Una carga fallida no altera el escenario vigente.</w:t>
       </w:r>
     </w:p>
     <w:p>
@@ -12303,7 +12243,7 @@
         <w:pStyle w:val="Ttulo2"/>
       </w:pPr>
       <w:bookmarkStart w:id="74" w:name="modos-de-prueba"/>
-      <w:bookmarkStart w:id="75" w:name="_Toc243182360"/>
+      <w:bookmarkStart w:id="75" w:name="_Toc243184711"/>
       <w:bookmarkEnd w:id="72"/>
       <w:r>
         <w:t>10.3. Modos de prueba</w:t>
@@ -12618,7 +12558,7 @@
         <w:pStyle w:val="Ttulo2"/>
       </w:pPr>
       <w:bookmarkStart w:id="76" w:name="verificador-de-soluciones"/>
-      <w:bookmarkStart w:id="77" w:name="_Toc243182361"/>
+      <w:bookmarkStart w:id="77" w:name="_Toc243184712"/>
       <w:bookmarkEnd w:id="74"/>
       <w:r>
         <w:t>10.4. Verificador de soluciones</w:t>
@@ -12674,10 +12614,7 @@
         <w:t>Cada movimiento es válido:</w:t>
       </w:r>
       <w:r>
-        <w:t xml:space="preserve"> </w:t>
-      </w:r>
-      <w:r>
-        <w:t>cada acción es ortogonal, parte de la posición actual y es legal en el estado alcanzado.</w:t>
+        <w:t xml:space="preserve"> cada acción es ortogonal, parte de la posición actual y es legal en el estado alcanzado.</w:t>
       </w:r>
     </w:p>
     <w:p>
@@ -12753,10 +12690,7 @@
         <w:t>No se generan estados inválidos:</w:t>
       </w:r>
       <w:r>
-        <w:t xml:space="preserve"> cada estado del camino o del árbol cumple los invariantes: ids únicos, </w:t>
-      </w:r>
-      <w:r>
-        <w:t>posiciones legales, recurso coherente y victoria real.</w:t>
+        <w:t xml:space="preserve"> cada estado del camino o del árbol cumple los invariantes: ids únicos, posiciones legales, recurso coherente y victoria real.</w:t>
       </w:r>
     </w:p>
     <w:p>
@@ -12804,7 +12738,7 @@
         <w:pStyle w:val="Ttulo1"/>
       </w:pPr>
       <w:bookmarkStart w:id="78" w:name="metodología-experimental"/>
-      <w:bookmarkStart w:id="79" w:name="_Toc243182362"/>
+      <w:bookmarkStart w:id="79" w:name="_Toc243184713"/>
       <w:bookmarkEnd w:id="68"/>
       <w:bookmarkEnd w:id="76"/>
       <w:r>
@@ -12920,10 +12854,7 @@
         <w:t>Ejecutar y comparar.</w:t>
       </w:r>
       <w:r>
-        <w:t xml:space="preserve"> </w:t>
-      </w:r>
-      <w:r>
-        <w:t>El resultado obtenido se contrasta con el esperado.</w:t>
+        <w:t xml:space="preserve"> El resultado obtenido se contrasta con el esperado.</w:t>
       </w:r>
     </w:p>
     <w:p>
@@ -13003,10 +12934,7 @@
         <w:t>Nota:</w:t>
       </w:r>
       <w:r>
-        <w:t xml:space="preserve"> </w:t>
-      </w:r>
-      <w:r>
-        <w:t>Los tiempos dependen de la máquina y se reportan como orientación; las conclusiones se basan en los contadores. La comparación temporal de las heurísticas (E6.2) se hizo aparte: 10 calentamientos y 50 repeticiones por estrategia, en orden aleatorio con semilla fija, reportando medianas.</w:t>
+        <w:t xml:space="preserve"> Los tiempos dependen de la máquina y se reportan como orientación; las conclusiones se basan en los contadores. La comparación temporal de las heurísticas (E6.2) se hizo aparte: 10 calentamientos y 50 repeticiones por estrategia, en orden aleatorio con semilla fija, reportando medianas.</w:t>
       </w:r>
     </w:p>
     <w:p>
@@ -13040,7 +12968,7 @@
         <w:pStyle w:val="Ttulo1"/>
       </w:pPr>
       <w:bookmarkStart w:id="80" w:name="resultados"/>
-      <w:bookmarkStart w:id="81" w:name="_Toc243182363"/>
+      <w:bookmarkStart w:id="81" w:name="_Toc243184714"/>
       <w:bookmarkEnd w:id="78"/>
       <w:r>
         <w:t>12. Resultados</w:t>
@@ -13052,7 +12980,7 @@
         <w:pStyle w:val="Ttulo2"/>
       </w:pPr>
       <w:bookmarkStart w:id="82" w:name="casos-mínimos"/>
-      <w:bookmarkStart w:id="83" w:name="_Toc243182364"/>
+      <w:bookmarkStart w:id="83" w:name="_Toc243184715"/>
       <w:r>
         <w:t>12.1. Casos mínimos</w:t>
       </w:r>
@@ -14080,7 +14008,7 @@
         <w:pStyle w:val="Ttulo2"/>
       </w:pPr>
       <w:bookmarkStart w:id="84" w:name="búsquedas-por-escenario"/>
-      <w:bookmarkStart w:id="85" w:name="_Toc243182365"/>
+      <w:bookmarkStart w:id="85" w:name="_Toc243184716"/>
       <w:bookmarkEnd w:id="82"/>
       <w:r>
         <w:t>12.2. Búsquedas por escenario</w:t>
@@ -14785,10 +14713,7 @@
         <w:t>DFS</w:t>
       </w:r>
       <w:r>
-        <w:t xml:space="preserve"> </w:t>
-      </w:r>
-      <w:r>
-        <w:t>expande poco, pero su camino es arbitrario: 98 movimientos en el 20 × 20. En esta búsqueda en grafo, la pila acumula hermanos pendientes y su frontera supera la de BFS.</w:t>
+        <w:t xml:space="preserve"> expande poco, pero su camino es arbitrario: 98 movimientos en el 20 × 20. En esta búsqueda en grafo, la pila acumula hermanos pendientes y su frontera supera la de BFS.</w:t>
       </w:r>
     </w:p>
     <w:p>
@@ -14835,10 +14760,7 @@
         <w:t>obstaculo_rodeo.json</w:t>
       </w:r>
       <w:r>
-        <w:t xml:space="preserve"> (1,19 ms frente a </w:t>
-      </w:r>
-      <w:r>
-        <w:t>1,28 ms) y peor en los otros dos escenarios.</w:t>
+        <w:t xml:space="preserve"> (1,19 ms frente a 1,28 ms) y peor en los otros dos escenarios.</w:t>
       </w:r>
     </w:p>
     <w:p>
@@ -14846,7 +14768,7 @@
         <w:pStyle w:val="Ttulo2"/>
       </w:pPr>
       <w:bookmarkStart w:id="86" w:name="beam-search-efecto-de-k"/>
-      <w:bookmarkStart w:id="87" w:name="_Toc243182366"/>
+      <w:bookmarkStart w:id="87" w:name="_Toc243184717"/>
       <w:bookmarkEnd w:id="84"/>
       <w:r>
         <w:t>12.3. Beam Search: efecto de k</w:t>
@@ -15589,10 +15511,7 @@
         <w:t>k</w:t>
       </w:r>
       <w:r>
-        <w:t xml:space="preserve"> deja </w:t>
-      </w:r>
-      <w:r>
-        <w:t>entrar el corredor de pantano, que llega al objetivo en menos niveles y sube el costo de 12 a 50.</w:t>
+        <w:t xml:space="preserve"> deja entrar el corredor de pantano, que llega al objetivo en menos niveles y sube el costo de 12 a 50.</w:t>
       </w:r>
     </w:p>
     <w:p>
@@ -15619,7 +15538,7 @@
         <w:pStyle w:val="Ttulo2"/>
       </w:pPr>
       <w:bookmarkStart w:id="88" w:name="minimax-y-alfa-beta"/>
-      <w:bookmarkStart w:id="89" w:name="_Toc243182367"/>
+      <w:bookmarkStart w:id="89" w:name="_Toc243184718"/>
       <w:bookmarkEnd w:id="86"/>
       <w:r>
         <w:t>12.4. Minimax y alfa-beta</w:t>
@@ -16718,7 +16637,7 @@
         <w:pStyle w:val="Ttulo2"/>
       </w:pPr>
       <w:bookmarkStart w:id="90" w:name="partidas-completas"/>
-      <w:bookmarkStart w:id="91" w:name="_Toc243182368"/>
+      <w:bookmarkStart w:id="91" w:name="_Toc243184719"/>
       <w:bookmarkEnd w:id="88"/>
       <w:r>
         <w:t>12.5. Partidas completas</w:t>
@@ -16855,7 +16774,7 @@
         <w:pStyle w:val="Ttulo2"/>
       </w:pPr>
       <w:bookmarkStart w:id="92" w:name="X4839b1143085a05863a2c719a5bbcbfc4cc6515"/>
-      <w:bookmarkStart w:id="93" w:name="_Toc243182369"/>
+      <w:bookmarkStart w:id="93" w:name="_Toc243184720"/>
       <w:bookmarkEnd w:id="90"/>
       <w:r>
         <w:t>12.6. Prueba de adaptación: pantano de costo 7 a 15</w:t>
@@ -17333,7 +17252,7 @@
         <w:pStyle w:val="Ttulo1"/>
       </w:pPr>
       <w:bookmarkStart w:id="94" w:name="análisis-de-complejidad"/>
-      <w:bookmarkStart w:id="95" w:name="_Toc243182370"/>
+      <w:bookmarkStart w:id="95" w:name="_Toc243184721"/>
       <w:bookmarkEnd w:id="80"/>
       <w:bookmarkEnd w:id="92"/>
       <w:r>
@@ -18490,10 +18409,7 @@
         <w:t>recurso_en_transporte.json</w:t>
       </w:r>
       <w:r>
-        <w:t xml:space="preserve"> </w:t>
-      </w:r>
-      <w:r>
-        <w:t xml:space="preserve">y 11 en </w:t>
+        <w:t xml:space="preserve"> y 11 en </w:t>
       </w:r>
       <w:r>
         <w:rPr>
@@ -18538,7 +18454,7 @@
         <w:pStyle w:val="Ttulo1"/>
       </w:pPr>
       <w:bookmarkStart w:id="96" w:name="pruebas-y-control-de-calidad"/>
-      <w:bookmarkStart w:id="97" w:name="_Toc243182371"/>
+      <w:bookmarkStart w:id="97" w:name="_Toc243184722"/>
       <w:bookmarkEnd w:id="94"/>
       <w:r>
         <w:t>14. Pruebas y control de calidad</w:t>
@@ -18550,7 +18466,7 @@
         <w:pStyle w:val="Ttulo2"/>
       </w:pPr>
       <w:bookmarkStart w:id="98" w:name="pruebas-automatizadas"/>
-      <w:bookmarkStart w:id="99" w:name="_Toc243182372"/>
+      <w:bookmarkStart w:id="99" w:name="_Toc243184723"/>
       <w:r>
         <w:t>14.1. Pruebas automatizadas</w:t>
       </w:r>
@@ -18567,7 +18483,7 @@
         <w:t>python -m pytest</w:t>
       </w:r>
       <w:r>
-        <w:t xml:space="preserve"> ejecuta 924 pruebas. Son independientes de Pygame, salvo las de la interfaz, que usan el controlador de video </w:t>
+        <w:t xml:space="preserve"> ejecuta 909 pruebas. Son independientes de Pygame, salvo las de la interfaz, que usan el controlador de video </w:t>
       </w:r>
       <w:r>
         <w:rPr>
@@ -18577,16 +18493,7 @@
         <w:t>dummy</w:t>
       </w:r>
       <w:r>
-        <w:t xml:space="preserve">. Con las dependencias opcionales </w:t>
-      </w:r>
-      <w:r>
-        <w:rPr>
-          <w:rStyle w:val="VerbatimChar"/>
-        </w:rPr>
-        <w:t>documentos</w:t>
-      </w:r>
-      <w:r>
-        <w:t xml:space="preserve"> se suman 12 pruebas que comprueban el diseño del Word generado; sin ellas, se omiten.</w:t>
+        <w:t>.</w:t>
       </w:r>
     </w:p>
     <w:tbl>
@@ -19030,7 +18937,7 @@
               <w:rPr>
                 <w:sz w:val="17"/>
               </w:rPr>
-              <w:t>48</w:t>
+              <w:t>33</w:t>
             </w:r>
           </w:p>
         </w:tc>
@@ -19047,7 +18954,7 @@
               <w:rPr>
                 <w:sz w:val="17"/>
               </w:rPr>
-              <w:t>Despachador, convención de documentación, este documento y servidor ASGI.</w:t>
+              <w:t>Despachador, convención de documentación de métodos y servidor ASGI.</w:t>
             </w:r>
           </w:p>
         </w:tc>
@@ -19096,10 +19003,7 @@
         <w:t>Oráculos independientes:</w:t>
       </w:r>
       <w:r>
-        <w:t xml:space="preserve"> </w:t>
-      </w:r>
-      <w:r>
-        <w:t>BFS y Dijkstra escritos en las pruebas para validar HTO.</w:t>
+        <w:t xml:space="preserve"> BFS y Dijkstra escritos en las pruebas para validar HTO.</w:t>
       </w:r>
     </w:p>
     <w:p>
@@ -19174,7 +19078,7 @@
         <w:pStyle w:val="Ttulo2"/>
       </w:pPr>
       <w:bookmarkStart w:id="100" w:name="verificación-en-tiempo-de-ejecución"/>
-      <w:bookmarkStart w:id="101" w:name="_Toc243182373"/>
+      <w:bookmarkStart w:id="101" w:name="_Toc243184724"/>
       <w:bookmarkEnd w:id="98"/>
       <w:r>
         <w:t>14.2. Verificación en tiempo de ejecución</w:t>
@@ -19192,10 +19096,7 @@
         <w:t>--verificar</w:t>
       </w:r>
       <w:r>
-        <w:t xml:space="preserve"> </w:t>
-      </w:r>
-      <w:r>
-        <w:t>aplica el verificador de la sección 10.4 a cualquier ejecución de consola, incluidos los escenarios externos del profesor.</w:t>
+        <w:t xml:space="preserve"> aplica el verificador de la sección 10.4 a cualquier ejecución de consola, incluidos los escenarios externos del profesor.</w:t>
       </w:r>
     </w:p>
     <w:p>
@@ -19203,7 +19104,7 @@
         <w:pStyle w:val="Ttulo2"/>
       </w:pPr>
       <w:bookmarkStart w:id="102" w:name="documentación-de-métodos"/>
-      <w:bookmarkStart w:id="103" w:name="_Toc243182374"/>
+      <w:bookmarkStart w:id="103" w:name="_Toc243184725"/>
       <w:bookmarkEnd w:id="100"/>
       <w:r>
         <w:t>14.3. Documentación de métodos</w:t>
@@ -19242,28 +19143,7 @@
         <w:t>tests/test_documentacion_metodos.py</w:t>
       </w:r>
       <w:r>
-        <w:t xml:space="preserve"> </w:t>
-      </w:r>
-      <w:r>
-        <w:t>hace cumplir esa convención en todo el código.</w:t>
-      </w:r>
-    </w:p>
-    <w:p>
-      <w:pPr>
-        <w:pStyle w:val="Compact"/>
-        <w:numPr>
-          <w:ilvl w:val="0"/>
-          <w:numId w:val="29"/>
-        </w:numPr>
-      </w:pPr>
-      <w:r>
-        <w:rPr>
-          <w:rStyle w:val="VerbatimChar"/>
-        </w:rPr>
-        <w:t>tests/test_documento_tecnico.py</w:t>
-      </w:r>
-      <w:r>
-        <w:t xml:space="preserve"> comprueba que este documento cubra los contenidos del enunciado y que toda ruta que cita exista.</w:t>
+        <w:t xml:space="preserve"> hace cumplir esa convención en todo el código.</w:t>
       </w:r>
     </w:p>
     <w:p>
@@ -19282,7 +19162,7 @@
         <w:pStyle w:val="Ttulo1"/>
       </w:pPr>
       <w:bookmarkStart w:id="104" w:name="limitaciones"/>
-      <w:bookmarkStart w:id="105" w:name="_Toc243182375"/>
+      <w:bookmarkStart w:id="105" w:name="_Toc243184726"/>
       <w:bookmarkEnd w:id="96"/>
       <w:bookmarkEnd w:id="102"/>
       <w:r>
@@ -19630,13 +19510,7 @@
               <w:rPr>
                 <w:sz w:val="17"/>
               </w:rPr>
-              <w:t>Una jugada puede rotularse</w:t>
-            </w:r>
-            <w:r>
-              <w:rPr>
-                <w:sz w:val="17"/>
-              </w:rPr>
-              <w:t xml:space="preserve"> </w:t>
+              <w:t xml:space="preserve">Una jugada puede rotularse </w:t>
             </w:r>
             <w:r>
               <w:rPr>
@@ -20015,13 +19889,7 @@
               <w:rPr>
                 <w:sz w:val="17"/>
               </w:rPr>
-              <w:t xml:space="preserve"> </w:t>
-            </w:r>
-            <w:r>
-              <w:rPr>
-                <w:sz w:val="17"/>
-              </w:rPr>
-              <w:t>contra modificaciones es superficial.</w:t>
+              <w:t xml:space="preserve"> contra modificaciones es superficial.</w:t>
             </w:r>
           </w:p>
         </w:tc>
@@ -20133,7 +20001,7 @@
         <w:pStyle w:val="Ttulo1"/>
       </w:pPr>
       <w:bookmarkStart w:id="106" w:name="reproducibilidad"/>
-      <w:bookmarkStart w:id="107" w:name="_Toc243182376"/>
+      <w:bookmarkStart w:id="107" w:name="_Toc243184727"/>
       <w:bookmarkEnd w:id="104"/>
       <w:r>
         <w:t>16. Reproducibilidad</w:t>
@@ -20394,7 +20262,7 @@
         <w:pStyle w:val="Ttulo1"/>
       </w:pPr>
       <w:bookmarkStart w:id="108" w:name="reporte-del-uso-de-ia"/>
-      <w:bookmarkStart w:id="109" w:name="_Toc243182377"/>
+      <w:bookmarkStart w:id="109" w:name="_Toc243184728"/>
       <w:bookmarkEnd w:id="106"/>
       <w:r>
         <w:t>17. Reporte del uso de IA</w:t>
@@ -20406,7 +20274,7 @@
         <w:pStyle w:val="Ttulo2"/>
       </w:pPr>
       <w:bookmarkStart w:id="110" w:name="declaración"/>
-      <w:bookmarkStart w:id="111" w:name="_Toc243182378"/>
+      <w:bookmarkStart w:id="111" w:name="_Toc243184729"/>
       <w:r>
         <w:t>17.1. Declaración</w:t>
       </w:r>
@@ -20482,10 +20350,7 @@
         <w:t>Claude (Anthropic: Opus 5.5, Sonnet 5.5 y Sonnet 5):</w:t>
       </w:r>
       <w:r>
-        <w:t xml:space="preserve"> recurso y transporte (E3.2); intercepción y tácticas (E8.1); Beam Search (E7); utilidad, Minimax, alfa-beta, comparación y orden de acciones (E8.2 a E8.6); modos de </w:t>
-      </w:r>
-      <w:r>
-        <w:t>prueba, verificador y registro (E10); y la unificación de la documentación de métodos (E11.1).</w:t>
+        <w:t xml:space="preserve"> recurso y transporte (E3.2); intercepción y tácticas (E8.1); Beam Search (E7); utilidad, Minimax, alfa-beta, comparación y orden de acciones (E8.2 a E8.6); modos de prueba, verificador y registro (E10); y la unificación de la documentación de métodos (E11.1).</w:t>
       </w:r>
     </w:p>
     <w:p>
@@ -20501,7 +20366,7 @@
         <w:pStyle w:val="Ttulo2"/>
       </w:pPr>
       <w:bookmarkStart w:id="112" w:name="tipo-de-intervención"/>
-      <w:bookmarkStart w:id="113" w:name="_Toc243182379"/>
+      <w:bookmarkStart w:id="113" w:name="_Toc243184730"/>
       <w:bookmarkEnd w:id="110"/>
       <w:r>
         <w:t>17.2. Tipo de intervención</w:t>
@@ -20543,10 +20408,7 @@
         <w:t>Diseño y análisis:</w:t>
       </w:r>
       <w:r>
-        <w:t xml:space="preserve"> comparación de heurísticas, demostraciones de admisibilidad y consistencia de HTO, </w:t>
-      </w:r>
-      <w:r>
-        <w:t>justificación de los pesos de la utilidad y análisis de complejidad.</w:t>
+        <w:t xml:space="preserve"> comparación de heurísticas, demostraciones de admisibilidad y consistencia de HTO, justificación de los pesos de la utilidad y análisis de complejidad.</w:t>
       </w:r>
     </w:p>
     <w:p>
@@ -20611,7 +20473,7 @@
         <w:pStyle w:val="Ttulo2"/>
       </w:pPr>
       <w:bookmarkStart w:id="114" w:name="cómo-se-validó-el-aporte"/>
-      <w:bookmarkStart w:id="115" w:name="_Toc243182380"/>
+      <w:bookmarkStart w:id="115" w:name="_Toc243184731"/>
       <w:bookmarkEnd w:id="112"/>
       <w:r>
         <w:t>17.3. Cómo se validó el aporte</w:t>
@@ -20634,10 +20496,7 @@
         <w:t>Revisión del código.</w:t>
       </w:r>
       <w:r>
-        <w:t xml:space="preserve"> </w:t>
-      </w:r>
-      <w:r>
-        <w:t xml:space="preserve">El equipo revisó cada aporte, integrado a </w:t>
+        <w:t xml:space="preserve"> El equipo revisó cada aporte, integrado a </w:t>
       </w:r>
       <w:r>
         <w:rPr>
@@ -20665,7 +20524,7 @@
         <w:t>Pruebas automatizadas.</w:t>
       </w:r>
       <w:r>
-        <w:t xml:space="preserve"> Ningún aporte se aceptó sin pruebas. En esta versión pasan 924.</w:t>
+        <w:t xml:space="preserve"> Ningún aporte se aceptó sin pruebas. En esta versión pasan 909.</w:t>
       </w:r>
     </w:p>
     <w:p>
@@ -20703,10 +20562,7 @@
         <w:t>Verificador.</w:t>
       </w:r>
       <w:r>
-        <w:t xml:space="preserve"> </w:t>
-      </w:r>
-      <w:r>
-        <w:t>Las respuestas se comprueban con las reglas del juego, no con los cálculos del algoritmo.</w:t>
+        <w:t xml:space="preserve"> Las respuestas se comprueban con las reglas del juego, no con los cálculos del algoritmo.</w:t>
       </w:r>
     </w:p>
     <w:p>
@@ -20725,7 +20581,7 @@
         <w:t>Coherencia documental.</w:t>
       </w:r>
       <w:r>
-        <w:t xml:space="preserve"> Una prueba falla si la documentación de un método queda incompleta, y otra si este documento cita archivos que no existen.</w:t>
+        <w:t xml:space="preserve"> Una prueba falla si la documentación de un método queda incompleta o usa etiquetas distintas de las convenidas.</w:t>
       </w:r>
     </w:p>
     <w:p>
@@ -20733,7 +20589,7 @@
         <w:pStyle w:val="Ttulo2"/>
       </w:pPr>
       <w:bookmarkStart w:id="116" w:name="responsabilidad"/>
-      <w:bookmarkStart w:id="117" w:name="_Toc243182381"/>
+      <w:bookmarkStart w:id="117" w:name="_Toc243184732"/>
       <w:bookmarkEnd w:id="114"/>
       <w:r>
         <w:t>17.4. Responsabilidad</w:t>
@@ -20761,7 +20617,7 @@
         <w:pStyle w:val="Ttulo2"/>
       </w:pPr>
       <w:bookmarkStart w:id="118" w:name="uso-de-ia-en-este-documento"/>
-      <w:bookmarkStart w:id="119" w:name="_Toc243182382"/>
+      <w:bookmarkStart w:id="119" w:name="_Toc243184733"/>
       <w:bookmarkEnd w:id="116"/>
       <w:r>
         <w:t>17.5. Uso de IA en este documento</w:t>
@@ -20803,25 +20659,16 @@
         <w:t>Intervención:</w:t>
       </w:r>
       <w:r>
-        <w:t xml:space="preserve"> Claude (Opus 5.5) eligió la estructura a partir de plantillas de documentos de diseño técnico y redactó el borrador a partir del código, el README y los documentos de detalle. También regeneró todas las cifras con el código de esta versión, ejecutó el experimento del pantano y escribió </w:t>
+        <w:t xml:space="preserve"> Claude (Opus 5.5) eligió la estructura a partir de plantillas de documentos de diseño técnico y redactó el borrador a partir del código, el README y los documentos de detalle. También regeneró todas las cifras con el código de esta versión y ejecutó el experimento del pantano. Por último, aplicó el diseño editorial de </w:t>
       </w:r>
       <w:r>
         <w:rPr>
           <w:rStyle w:val="VerbatimChar"/>
         </w:rPr>
-        <w:t>tests/test_documento_tecnico.py</w:t>
-      </w:r>
-      <w:r>
-        <w:t xml:space="preserve">. Por último, aplicó el diseño editorial de </w:t>
-      </w:r>
-      <w:r>
-        <w:rPr>
-          <w:rStyle w:val="VerbatimChar"/>
-        </w:rPr>
         <w:t>DESIGN.md</w:t>
       </w:r>
       <w:r>
-        <w:t xml:space="preserve"> y la generación del Word.</w:t>
+        <w:t xml:space="preserve"> al Word.</w:t>
       </w:r>
     </w:p>
     <w:p>
@@ -20840,10 +20687,7 @@
         <w:t>Validación:</w:t>
       </w:r>
       <w:r>
-        <w:t xml:space="preserve"> </w:t>
-      </w:r>
-      <w:r>
-        <w:t>las cifras coinciden con las fijadas en las pruebas de los casos mínimos. El equipo revisa el documento completo antes de la entrega.</w:t>
+        <w:t xml:space="preserve"> las cifras coinciden con las fijadas en las pruebas de los casos mínimos. El equipo revisa el documento completo antes de la entrega.</w:t>
       </w:r>
     </w:p>
     <w:p>
@@ -20862,7 +20706,7 @@
         <w:pStyle w:val="Ttulo1"/>
       </w:pPr>
       <w:bookmarkStart w:id="120" w:name="anexo-a.-glosario"/>
-      <w:bookmarkStart w:id="121" w:name="_Toc243182383"/>
+      <w:bookmarkStart w:id="121" w:name="_Toc243184734"/>
       <w:bookmarkEnd w:id="108"/>
       <w:bookmarkEnd w:id="118"/>
       <w:r>
@@ -20971,10 +20815,7 @@
         <w:t>MAX y MIN:</w:t>
       </w:r>
       <w:r>
-        <w:t xml:space="preserve"> </w:t>
-      </w:r>
-      <w:r>
-        <w:t>roles del árbol Minimax, el bando en turno en la raíz y su rival. No son capacidades distintas.</w:t>
+        <w:t xml:space="preserve"> roles del árbol Minimax, el bando en turno en la raíz y su rival. No son capacidades distintas.</w:t>
       </w:r>
     </w:p>
     <w:p>
@@ -21020,7 +20861,7 @@
         <w:pStyle w:val="Ttulo1"/>
       </w:pPr>
       <w:bookmarkStart w:id="122" w:name="anexo-b.-escenarios-del-repositorio"/>
-      <w:bookmarkStart w:id="123" w:name="_Toc243182384"/>
+      <w:bookmarkStart w:id="123" w:name="_Toc243184735"/>
       <w:bookmarkEnd w:id="120"/>
       <w:r>
         <w:t>Anexo B. Escenarios del repositorio</w:t>

</xml_diff>